<commit_message>
updated assignments and progress report template + technical design template
</commit_message>
<xml_diff>
--- a/public/progress-report-template-cs462.docx
+++ b/public/progress-report-template-cs462.docx
@@ -208,13 +208,18 @@
     </w:p>
     <w:p>
       <w:pPr>
-        <w:rPr>
-          <w:sz w:val="20"/>
-          <w:szCs w:val="20"/>
-        </w:rPr>
-      </w:pPr>
-      <w:r>
-        <w:rPr>
+        <w:pStyle w:val="Heading1"/>
+        <w:rPr>
+          <w:rFonts w:asciiTheme="minorHAnsi" w:eastAsiaTheme="minorHAnsi" w:hAnsiTheme="minorHAnsi" w:cstheme="minorBidi"/>
+          <w:color w:val="auto"/>
+          <w:sz w:val="20"/>
+          <w:szCs w:val="20"/>
+        </w:rPr>
+      </w:pPr>
+      <w:r>
+        <w:rPr>
+          <w:rFonts w:asciiTheme="minorHAnsi" w:eastAsiaTheme="minorHAnsi" w:hAnsiTheme="minorHAnsi" w:cstheme="minorBidi"/>
+          <w:color w:val="auto"/>
           <w:sz w:val="20"/>
           <w:szCs w:val="20"/>
         </w:rPr>
@@ -244,732 +249,7 @@
           <w:sz w:val="32"/>
           <w:szCs w:val="32"/>
         </w:rPr>
-        <w:t>Progress vs</w:t>
-      </w:r>
-      <w:r>
-        <w:rPr>
-          <w:rFonts w:eastAsia="Times New Roman"/>
-          <w:sz w:val="32"/>
-          <w:szCs w:val="32"/>
-        </w:rPr>
-        <w:t>.</w:t>
-      </w:r>
-      <w:r>
-        <w:rPr>
-          <w:rFonts w:eastAsia="Times New Roman"/>
-          <w:sz w:val="32"/>
-          <w:szCs w:val="32"/>
-        </w:rPr>
-        <w:t xml:space="preserve"> Plan</w:t>
-      </w:r>
-    </w:p>
-    <w:tbl>
-      <w:tblPr>
-        <w:tblStyle w:val="TableGrid"/>
-        <w:tblW w:w="0" w:type="auto"/>
-        <w:tblLook w:val="04A0" w:firstRow="1" w:lastRow="0" w:firstColumn="1" w:lastColumn="0" w:noHBand="0" w:noVBand="1"/>
-      </w:tblPr>
-      <w:tblGrid>
-        <w:gridCol w:w="1157"/>
-        <w:gridCol w:w="1727"/>
-        <w:gridCol w:w="2060"/>
-        <w:gridCol w:w="1980"/>
-        <w:gridCol w:w="1620"/>
-        <w:gridCol w:w="1028"/>
-        <w:gridCol w:w="1218"/>
-      </w:tblGrid>
-      <w:tr>
-        <w:tc>
-          <w:tcPr>
-            <w:tcW w:w="0" w:type="auto"/>
-            <w:hideMark/>
-          </w:tcPr>
-          <w:p>
-            <w:pPr>
-              <w:spacing w:after="168"/>
-              <w:rPr>
-                <w:rFonts w:eastAsia="Times New Roman" w:cs="Segoe UI"/>
-                <w:b/>
-                <w:bCs/>
-                <w:color w:val="3B3B3B"/>
-                <w:kern w:val="0"/>
-                <w:sz w:val="20"/>
-                <w:szCs w:val="20"/>
-                <w14:ligatures w14:val="none"/>
-              </w:rPr>
-            </w:pPr>
-            <w:r>
-              <w:rPr>
-                <w:rFonts w:eastAsia="Times New Roman" w:cs="Segoe UI"/>
-                <w:b/>
-                <w:bCs/>
-                <w:color w:val="3B3B3B"/>
-                <w:kern w:val="0"/>
-                <w:sz w:val="20"/>
-                <w:szCs w:val="20"/>
-                <w14:ligatures w14:val="none"/>
-              </w:rPr>
-              <w:t>Planned item</w:t>
-            </w:r>
-          </w:p>
-        </w:tc>
-        <w:tc>
-          <w:tcPr>
-            <w:tcW w:w="1632" w:type="dxa"/>
-            <w:hideMark/>
-          </w:tcPr>
-          <w:p>
-            <w:pPr>
-              <w:spacing w:after="168"/>
-              <w:rPr>
-                <w:rFonts w:eastAsia="Times New Roman" w:cs="Segoe UI"/>
-                <w:b/>
-                <w:bCs/>
-                <w:color w:val="3B3B3B"/>
-                <w:kern w:val="0"/>
-                <w:sz w:val="20"/>
-                <w:szCs w:val="20"/>
-                <w14:ligatures w14:val="none"/>
-              </w:rPr>
-            </w:pPr>
-            <w:r>
-              <w:rPr>
-                <w:rFonts w:eastAsia="Times New Roman" w:cs="Segoe UI"/>
-                <w:b/>
-                <w:bCs/>
-                <w:color w:val="3B3B3B"/>
-                <w:kern w:val="0"/>
-                <w:sz w:val="20"/>
-                <w:szCs w:val="20"/>
-                <w14:ligatures w14:val="none"/>
-              </w:rPr>
-              <w:t>Status (% or done/partial/not done)</w:t>
-            </w:r>
-          </w:p>
-        </w:tc>
-        <w:tc>
-          <w:tcPr>
-            <w:tcW w:w="2060" w:type="dxa"/>
-            <w:hideMark/>
-          </w:tcPr>
-          <w:p>
-            <w:pPr>
-              <w:spacing w:after="168"/>
-              <w:rPr>
-                <w:rFonts w:eastAsia="Times New Roman" w:cs="Segoe UI"/>
-                <w:b/>
-                <w:bCs/>
-                <w:color w:val="3B3B3B"/>
-                <w:kern w:val="0"/>
-                <w:sz w:val="20"/>
-                <w:szCs w:val="20"/>
-                <w14:ligatures w14:val="none"/>
-              </w:rPr>
-            </w:pPr>
-            <w:r>
-              <w:rPr>
-                <w:rFonts w:eastAsia="Times New Roman" w:cs="Segoe UI"/>
-                <w:b/>
-                <w:bCs/>
-                <w:color w:val="3B3B3B"/>
-                <w:kern w:val="0"/>
-                <w:sz w:val="20"/>
-                <w:szCs w:val="20"/>
-                <w14:ligatures w14:val="none"/>
-              </w:rPr>
-              <w:t>Links (issue/PR)</w:t>
-            </w:r>
-          </w:p>
-        </w:tc>
-        <w:tc>
-          <w:tcPr>
-            <w:tcW w:w="1980" w:type="dxa"/>
-            <w:hideMark/>
-          </w:tcPr>
-          <w:p>
-            <w:pPr>
-              <w:spacing w:after="168"/>
-              <w:rPr>
-                <w:rFonts w:eastAsia="Times New Roman" w:cs="Segoe UI"/>
-                <w:b/>
-                <w:bCs/>
-                <w:color w:val="3B3B3B"/>
-                <w:kern w:val="0"/>
-                <w:sz w:val="20"/>
-                <w:szCs w:val="20"/>
-                <w14:ligatures w14:val="none"/>
-              </w:rPr>
-            </w:pPr>
-            <w:r>
-              <w:rPr>
-                <w:rFonts w:eastAsia="Times New Roman" w:cs="Segoe UI"/>
-                <w:b/>
-                <w:bCs/>
-                <w:color w:val="3B3B3B"/>
-                <w:kern w:val="0"/>
-                <w:sz w:val="20"/>
-                <w:szCs w:val="20"/>
-                <w14:ligatures w14:val="none"/>
-              </w:rPr>
-              <w:t>Notes/Blockers</w:t>
-            </w:r>
-          </w:p>
-        </w:tc>
-        <w:tc>
-          <w:tcPr>
-            <w:tcW w:w="1620" w:type="dxa"/>
-            <w:hideMark/>
-          </w:tcPr>
-          <w:p>
-            <w:pPr>
-              <w:spacing w:after="168"/>
-              <w:rPr>
-                <w:rFonts w:eastAsia="Times New Roman" w:cs="Segoe UI"/>
-                <w:b/>
-                <w:bCs/>
-                <w:color w:val="3B3B3B"/>
-                <w:kern w:val="0"/>
-                <w:sz w:val="20"/>
-                <w:szCs w:val="20"/>
-                <w14:ligatures w14:val="none"/>
-              </w:rPr>
-            </w:pPr>
-            <w:r>
-              <w:rPr>
-                <w:rFonts w:eastAsia="Times New Roman" w:cs="Segoe UI"/>
-                <w:b/>
-                <w:bCs/>
-                <w:color w:val="3B3B3B"/>
-                <w:kern w:val="0"/>
-                <w:sz w:val="20"/>
-                <w:szCs w:val="20"/>
-                <w14:ligatures w14:val="none"/>
-              </w:rPr>
-              <w:t>Plan change (if any)</w:t>
-            </w:r>
-          </w:p>
-        </w:tc>
-        <w:tc>
-          <w:tcPr>
-            <w:tcW w:w="1028" w:type="dxa"/>
-          </w:tcPr>
-          <w:p>
-            <w:pPr>
-              <w:spacing w:after="168"/>
-              <w:rPr>
-                <w:rFonts w:eastAsia="Times New Roman" w:cs="Segoe UI"/>
-                <w:i/>
-                <w:iCs/>
-                <w:color w:val="3B3B3B"/>
-                <w:kern w:val="0"/>
-                <w:sz w:val="20"/>
-                <w:szCs w:val="20"/>
-                <w14:ligatures w14:val="none"/>
-              </w:rPr>
-            </w:pPr>
-            <w:r>
-              <w:rPr>
-                <w:rFonts w:eastAsia="Times New Roman" w:cs="Segoe UI"/>
-                <w:i/>
-                <w:iCs/>
-                <w:color w:val="3B3B3B"/>
-                <w:kern w:val="0"/>
-                <w:sz w:val="20"/>
-                <w:szCs w:val="20"/>
-                <w14:ligatures w14:val="none"/>
-              </w:rPr>
-              <w:t>Author</w:t>
-            </w:r>
-          </w:p>
-        </w:tc>
-        <w:tc>
-          <w:tcPr>
-            <w:tcW w:w="0" w:type="auto"/>
-          </w:tcPr>
-          <w:p>
-            <w:pPr>
-              <w:spacing w:after="168"/>
-              <w:rPr>
-                <w:rFonts w:eastAsia="Times New Roman" w:cs="Segoe UI"/>
-                <w:i/>
-                <w:iCs/>
-                <w:color w:val="3B3B3B"/>
-                <w:kern w:val="0"/>
-                <w:sz w:val="20"/>
-                <w:szCs w:val="20"/>
-                <w14:ligatures w14:val="none"/>
-              </w:rPr>
-            </w:pPr>
-            <w:r>
-              <w:rPr>
-                <w:rFonts w:eastAsia="Times New Roman" w:cs="Segoe UI"/>
-                <w:i/>
-                <w:iCs/>
-                <w:color w:val="3B3B3B"/>
-                <w:kern w:val="0"/>
-                <w:sz w:val="20"/>
-                <w:szCs w:val="20"/>
-                <w14:ligatures w14:val="none"/>
-              </w:rPr>
-              <w:t>Reviewer(s)</w:t>
-            </w:r>
-          </w:p>
-        </w:tc>
-      </w:tr>
-      <w:tr>
-        <w:tc>
-          <w:tcPr>
-            <w:tcW w:w="0" w:type="auto"/>
-            <w:hideMark/>
-          </w:tcPr>
-          <w:p>
-            <w:pPr>
-              <w:spacing w:after="168"/>
-              <w:rPr>
-                <w:rFonts w:eastAsia="Times New Roman" w:cs="Segoe UI"/>
-                <w:b/>
-                <w:bCs/>
-                <w:color w:val="3B3B3B"/>
-                <w:kern w:val="0"/>
-                <w:sz w:val="20"/>
-                <w:szCs w:val="20"/>
-                <w14:ligatures w14:val="none"/>
-              </w:rPr>
-            </w:pPr>
-            <w:r>
-              <w:rPr>
-                <w:rFonts w:eastAsia="Times New Roman" w:cs="Segoe UI"/>
-                <w:b/>
-                <w:bCs/>
-                <w:color w:val="3B3B3B"/>
-                <w:kern w:val="0"/>
-                <w:sz w:val="20"/>
-                <w:szCs w:val="20"/>
-                <w14:ligatures w14:val="none"/>
-              </w:rPr>
-              <w:t>Item 1</w:t>
-            </w:r>
-          </w:p>
-        </w:tc>
-        <w:tc>
-          <w:tcPr>
-            <w:tcW w:w="1632" w:type="dxa"/>
-            <w:hideMark/>
-          </w:tcPr>
-          <w:p>
-            <w:pPr>
-              <w:spacing w:after="168"/>
-              <w:rPr>
-                <w:rFonts w:eastAsia="Times New Roman" w:cs="Segoe UI"/>
-                <w:color w:val="3B3B3B"/>
-                <w:kern w:val="0"/>
-                <w:sz w:val="20"/>
-                <w:szCs w:val="20"/>
-                <w14:ligatures w14:val="none"/>
-              </w:rPr>
-            </w:pPr>
-          </w:p>
-        </w:tc>
-        <w:tc>
-          <w:tcPr>
-            <w:tcW w:w="2060" w:type="dxa"/>
-            <w:hideMark/>
-          </w:tcPr>
-          <w:p>
-            <w:pPr>
-              <w:spacing w:after="168"/>
-              <w:rPr>
-                <w:rFonts w:eastAsia="Times New Roman" w:cs="Times New Roman"/>
-                <w:kern w:val="0"/>
-                <w:sz w:val="20"/>
-                <w:szCs w:val="20"/>
-                <w14:ligatures w14:val="none"/>
-              </w:rPr>
-            </w:pPr>
-          </w:p>
-        </w:tc>
-        <w:tc>
-          <w:tcPr>
-            <w:tcW w:w="1980" w:type="dxa"/>
-            <w:hideMark/>
-          </w:tcPr>
-          <w:p>
-            <w:pPr>
-              <w:spacing w:after="168"/>
-              <w:rPr>
-                <w:rFonts w:eastAsia="Times New Roman" w:cs="Times New Roman"/>
-                <w:kern w:val="0"/>
-                <w:sz w:val="20"/>
-                <w:szCs w:val="20"/>
-                <w14:ligatures w14:val="none"/>
-              </w:rPr>
-            </w:pPr>
-          </w:p>
-        </w:tc>
-        <w:tc>
-          <w:tcPr>
-            <w:tcW w:w="1620" w:type="dxa"/>
-            <w:hideMark/>
-          </w:tcPr>
-          <w:p>
-            <w:pPr>
-              <w:spacing w:after="168"/>
-              <w:rPr>
-                <w:rFonts w:eastAsia="Times New Roman" w:cs="Times New Roman"/>
-                <w:kern w:val="0"/>
-                <w:sz w:val="20"/>
-                <w:szCs w:val="20"/>
-                <w14:ligatures w14:val="none"/>
-              </w:rPr>
-            </w:pPr>
-          </w:p>
-        </w:tc>
-        <w:tc>
-          <w:tcPr>
-            <w:tcW w:w="1028" w:type="dxa"/>
-          </w:tcPr>
-          <w:p>
-            <w:pPr>
-              <w:spacing w:after="168"/>
-              <w:rPr>
-                <w:rFonts w:eastAsia="Times New Roman" w:cs="Times New Roman"/>
-                <w:kern w:val="0"/>
-                <w:sz w:val="20"/>
-                <w:szCs w:val="20"/>
-                <w14:ligatures w14:val="none"/>
-              </w:rPr>
-            </w:pPr>
-          </w:p>
-        </w:tc>
-        <w:tc>
-          <w:tcPr>
-            <w:tcW w:w="0" w:type="auto"/>
-          </w:tcPr>
-          <w:p>
-            <w:pPr>
-              <w:spacing w:after="168"/>
-              <w:rPr>
-                <w:rFonts w:eastAsia="Times New Roman" w:cs="Times New Roman"/>
-                <w:kern w:val="0"/>
-                <w:sz w:val="20"/>
-                <w:szCs w:val="20"/>
-                <w14:ligatures w14:val="none"/>
-              </w:rPr>
-            </w:pPr>
-          </w:p>
-        </w:tc>
-      </w:tr>
-      <w:tr>
-        <w:tc>
-          <w:tcPr>
-            <w:tcW w:w="0" w:type="auto"/>
-            <w:hideMark/>
-          </w:tcPr>
-          <w:p>
-            <w:pPr>
-              <w:spacing w:after="168"/>
-              <w:rPr>
-                <w:rFonts w:eastAsia="Times New Roman" w:cs="Segoe UI"/>
-                <w:b/>
-                <w:bCs/>
-                <w:color w:val="3B3B3B"/>
-                <w:kern w:val="0"/>
-                <w:sz w:val="20"/>
-                <w:szCs w:val="20"/>
-                <w14:ligatures w14:val="none"/>
-              </w:rPr>
-            </w:pPr>
-            <w:r>
-              <w:rPr>
-                <w:rFonts w:eastAsia="Times New Roman" w:cs="Segoe UI"/>
-                <w:b/>
-                <w:bCs/>
-                <w:color w:val="3B3B3B"/>
-                <w:kern w:val="0"/>
-                <w:sz w:val="20"/>
-                <w:szCs w:val="20"/>
-                <w14:ligatures w14:val="none"/>
-              </w:rPr>
-              <w:t>Item 2</w:t>
-            </w:r>
-          </w:p>
-        </w:tc>
-        <w:tc>
-          <w:tcPr>
-            <w:tcW w:w="1632" w:type="dxa"/>
-            <w:hideMark/>
-          </w:tcPr>
-          <w:p>
-            <w:pPr>
-              <w:spacing w:after="168"/>
-              <w:rPr>
-                <w:rFonts w:eastAsia="Times New Roman" w:cs="Segoe UI"/>
-                <w:color w:val="3B3B3B"/>
-                <w:kern w:val="0"/>
-                <w:sz w:val="20"/>
-                <w:szCs w:val="20"/>
-                <w14:ligatures w14:val="none"/>
-              </w:rPr>
-            </w:pPr>
-          </w:p>
-        </w:tc>
-        <w:tc>
-          <w:tcPr>
-            <w:tcW w:w="2060" w:type="dxa"/>
-            <w:hideMark/>
-          </w:tcPr>
-          <w:p>
-            <w:pPr>
-              <w:spacing w:after="168"/>
-              <w:rPr>
-                <w:rFonts w:eastAsia="Times New Roman" w:cs="Times New Roman"/>
-                <w:kern w:val="0"/>
-                <w:sz w:val="20"/>
-                <w:szCs w:val="20"/>
-                <w14:ligatures w14:val="none"/>
-              </w:rPr>
-            </w:pPr>
-          </w:p>
-        </w:tc>
-        <w:tc>
-          <w:tcPr>
-            <w:tcW w:w="1980" w:type="dxa"/>
-            <w:hideMark/>
-          </w:tcPr>
-          <w:p>
-            <w:pPr>
-              <w:spacing w:after="168"/>
-              <w:rPr>
-                <w:rFonts w:eastAsia="Times New Roman" w:cs="Times New Roman"/>
-                <w:kern w:val="0"/>
-                <w:sz w:val="20"/>
-                <w:szCs w:val="20"/>
-                <w14:ligatures w14:val="none"/>
-              </w:rPr>
-            </w:pPr>
-          </w:p>
-        </w:tc>
-        <w:tc>
-          <w:tcPr>
-            <w:tcW w:w="1620" w:type="dxa"/>
-            <w:hideMark/>
-          </w:tcPr>
-          <w:p>
-            <w:pPr>
-              <w:spacing w:after="168"/>
-              <w:rPr>
-                <w:rFonts w:eastAsia="Times New Roman" w:cs="Times New Roman"/>
-                <w:kern w:val="0"/>
-                <w:sz w:val="20"/>
-                <w:szCs w:val="20"/>
-                <w14:ligatures w14:val="none"/>
-              </w:rPr>
-            </w:pPr>
-          </w:p>
-        </w:tc>
-        <w:tc>
-          <w:tcPr>
-            <w:tcW w:w="1028" w:type="dxa"/>
-          </w:tcPr>
-          <w:p>
-            <w:pPr>
-              <w:spacing w:after="168"/>
-              <w:rPr>
-                <w:rFonts w:eastAsia="Times New Roman" w:cs="Times New Roman"/>
-                <w:kern w:val="0"/>
-                <w:sz w:val="20"/>
-                <w:szCs w:val="20"/>
-                <w14:ligatures w14:val="none"/>
-              </w:rPr>
-            </w:pPr>
-          </w:p>
-        </w:tc>
-        <w:tc>
-          <w:tcPr>
-            <w:tcW w:w="0" w:type="auto"/>
-          </w:tcPr>
-          <w:p>
-            <w:pPr>
-              <w:spacing w:after="168"/>
-              <w:rPr>
-                <w:rFonts w:eastAsia="Times New Roman" w:cs="Times New Roman"/>
-                <w:kern w:val="0"/>
-                <w:sz w:val="20"/>
-                <w:szCs w:val="20"/>
-                <w14:ligatures w14:val="none"/>
-              </w:rPr>
-            </w:pPr>
-          </w:p>
-        </w:tc>
-      </w:tr>
-      <w:tr>
-        <w:tc>
-          <w:tcPr>
-            <w:tcW w:w="0" w:type="auto"/>
-            <w:hideMark/>
-          </w:tcPr>
-          <w:p>
-            <w:pPr>
-              <w:spacing w:after="168"/>
-              <w:rPr>
-                <w:rFonts w:eastAsia="Times New Roman" w:cs="Segoe UI"/>
-                <w:b/>
-                <w:bCs/>
-                <w:color w:val="3B3B3B"/>
-                <w:kern w:val="0"/>
-                <w:sz w:val="20"/>
-                <w:szCs w:val="20"/>
-                <w14:ligatures w14:val="none"/>
-              </w:rPr>
-            </w:pPr>
-            <w:r>
-              <w:rPr>
-                <w:rFonts w:eastAsia="Times New Roman" w:cs="Segoe UI"/>
-                <w:b/>
-                <w:bCs/>
-                <w:color w:val="3B3B3B"/>
-                <w:kern w:val="0"/>
-                <w:sz w:val="20"/>
-                <w:szCs w:val="20"/>
-                <w14:ligatures w14:val="none"/>
-              </w:rPr>
-              <w:t>...</w:t>
-            </w:r>
-          </w:p>
-        </w:tc>
-        <w:tc>
-          <w:tcPr>
-            <w:tcW w:w="1632" w:type="dxa"/>
-            <w:hideMark/>
-          </w:tcPr>
-          <w:p>
-            <w:pPr>
-              <w:spacing w:after="168"/>
-              <w:rPr>
-                <w:rFonts w:eastAsia="Times New Roman" w:cs="Segoe UI"/>
-                <w:color w:val="3B3B3B"/>
-                <w:kern w:val="0"/>
-                <w:sz w:val="20"/>
-                <w:szCs w:val="20"/>
-                <w14:ligatures w14:val="none"/>
-              </w:rPr>
-            </w:pPr>
-          </w:p>
-        </w:tc>
-        <w:tc>
-          <w:tcPr>
-            <w:tcW w:w="2060" w:type="dxa"/>
-            <w:hideMark/>
-          </w:tcPr>
-          <w:p>
-            <w:pPr>
-              <w:spacing w:after="168"/>
-              <w:rPr>
-                <w:rFonts w:eastAsia="Times New Roman" w:cs="Times New Roman"/>
-                <w:kern w:val="0"/>
-                <w:sz w:val="20"/>
-                <w:szCs w:val="20"/>
-                <w14:ligatures w14:val="none"/>
-              </w:rPr>
-            </w:pPr>
-          </w:p>
-        </w:tc>
-        <w:tc>
-          <w:tcPr>
-            <w:tcW w:w="1980" w:type="dxa"/>
-            <w:hideMark/>
-          </w:tcPr>
-          <w:p>
-            <w:pPr>
-              <w:spacing w:after="168"/>
-              <w:rPr>
-                <w:rFonts w:eastAsia="Times New Roman" w:cs="Times New Roman"/>
-                <w:kern w:val="0"/>
-                <w:sz w:val="20"/>
-                <w:szCs w:val="20"/>
-                <w14:ligatures w14:val="none"/>
-              </w:rPr>
-            </w:pPr>
-          </w:p>
-        </w:tc>
-        <w:tc>
-          <w:tcPr>
-            <w:tcW w:w="1620" w:type="dxa"/>
-            <w:hideMark/>
-          </w:tcPr>
-          <w:p>
-            <w:pPr>
-              <w:spacing w:after="168"/>
-              <w:rPr>
-                <w:rFonts w:eastAsia="Times New Roman" w:cs="Times New Roman"/>
-                <w:kern w:val="0"/>
-                <w:sz w:val="20"/>
-                <w:szCs w:val="20"/>
-                <w14:ligatures w14:val="none"/>
-              </w:rPr>
-            </w:pPr>
-          </w:p>
-        </w:tc>
-        <w:tc>
-          <w:tcPr>
-            <w:tcW w:w="1028" w:type="dxa"/>
-          </w:tcPr>
-          <w:p>
-            <w:pPr>
-              <w:spacing w:after="168"/>
-              <w:rPr>
-                <w:rFonts w:eastAsia="Times New Roman" w:cs="Times New Roman"/>
-                <w:kern w:val="0"/>
-                <w:sz w:val="20"/>
-                <w:szCs w:val="20"/>
-                <w14:ligatures w14:val="none"/>
-              </w:rPr>
-            </w:pPr>
-          </w:p>
-        </w:tc>
-        <w:tc>
-          <w:tcPr>
-            <w:tcW w:w="0" w:type="auto"/>
-          </w:tcPr>
-          <w:p>
-            <w:pPr>
-              <w:spacing w:after="168"/>
-              <w:rPr>
-                <w:rFonts w:eastAsia="Times New Roman" w:cs="Times New Roman"/>
-                <w:kern w:val="0"/>
-                <w:sz w:val="20"/>
-                <w:szCs w:val="20"/>
-                <w14:ligatures w14:val="none"/>
-              </w:rPr>
-            </w:pPr>
-          </w:p>
-        </w:tc>
-      </w:tr>
-    </w:tbl>
-    <w:p>
-      <w:pPr>
-        <w:pStyle w:val="Heading1"/>
-        <w:rPr>
-          <w:rFonts w:eastAsia="Times New Roman"/>
-          <w:sz w:val="32"/>
-          <w:szCs w:val="32"/>
-        </w:rPr>
-      </w:pPr>
-      <w:r>
-        <w:rPr>
-          <w:rFonts w:eastAsia="Times New Roman"/>
-          <w:sz w:val="32"/>
-          <w:szCs w:val="32"/>
-        </w:rPr>
-        <w:t xml:space="preserve">3. </w:t>
-      </w:r>
-      <w:r>
-        <w:rPr>
-          <w:rFonts w:eastAsia="Times New Roman"/>
-          <w:sz w:val="32"/>
-          <w:szCs w:val="32"/>
-        </w:rPr>
-        <w:t>Evidence of Working Software</w:t>
+        <w:t>Sprint Work Log (incl. Evidence + Attribution)</w:t>
       </w:r>
     </w:p>
     <w:p>
@@ -984,7 +264,101 @@
           <w:sz w:val="20"/>
           <w:szCs w:val="20"/>
         </w:rPr>
-        <w:t>Provide verifiable artifacts (at least one from the items below) for the items in the above section (Progress vs. Plan):</w:t>
+        <w:t>List the work items you completed or meaningfully worked on during the sprint. A </w:t>
+      </w:r>
+      <w:r>
+        <w:rPr>
+          <w:b/>
+          <w:bCs/>
+          <w:sz w:val="20"/>
+          <w:szCs w:val="20"/>
+        </w:rPr>
+        <w:t>list format</w:t>
+      </w:r>
+      <w:r>
+        <w:rPr>
+          <w:sz w:val="20"/>
+          <w:szCs w:val="20"/>
+        </w:rPr>
+        <w:t> is preferred over a table (tables can become hard to read with many items).</w:t>
+      </w:r>
+    </w:p>
+    <w:p>
+      <w:pPr>
+        <w:rPr>
+          <w:sz w:val="20"/>
+          <w:szCs w:val="20"/>
+        </w:rPr>
+      </w:pPr>
+      <w:r>
+        <w:rPr>
+          <w:sz w:val="20"/>
+          <w:szCs w:val="20"/>
+        </w:rPr>
+        <w:t>Each item must be </w:t>
+      </w:r>
+      <w:r>
+        <w:rPr>
+          <w:b/>
+          <w:bCs/>
+          <w:sz w:val="20"/>
+          <w:szCs w:val="20"/>
+        </w:rPr>
+        <w:t>measurable</w:t>
+      </w:r>
+      <w:r>
+        <w:rPr>
+          <w:sz w:val="20"/>
+          <w:szCs w:val="20"/>
+        </w:rPr>
+        <w:t> and include </w:t>
+      </w:r>
+      <w:r>
+        <w:rPr>
+          <w:b/>
+          <w:bCs/>
+          <w:sz w:val="20"/>
+          <w:szCs w:val="20"/>
+        </w:rPr>
+        <w:t>evidence</w:t>
+      </w:r>
+      <w:r>
+        <w:rPr>
+          <w:sz w:val="20"/>
+          <w:szCs w:val="20"/>
+        </w:rPr>
+        <w:t> and </w:t>
+      </w:r>
+      <w:r>
+        <w:rPr>
+          <w:b/>
+          <w:bCs/>
+          <w:sz w:val="20"/>
+          <w:szCs w:val="20"/>
+        </w:rPr>
+        <w:t>attribution</w:t>
+      </w:r>
+      <w:r>
+        <w:rPr>
+          <w:sz w:val="20"/>
+          <w:szCs w:val="20"/>
+        </w:rPr>
+        <w:t>. Items can be requirements work, bug fixes, infrastructure work, stakeholder/marketing/outreach tasks, research/spikes, documentation, etc.</w:t>
+      </w:r>
+    </w:p>
+    <w:p>
+      <w:pPr>
+        <w:rPr>
+          <w:sz w:val="20"/>
+          <w:szCs w:val="20"/>
+        </w:rPr>
+      </w:pPr>
+      <w:r>
+        <w:rPr>
+          <w:sz w:val="20"/>
+          <w:szCs w:val="20"/>
+        </w:rPr>
+        <w:t>For each work item, include:</w:t>
       </w:r>
     </w:p>
     <w:p>
@@ -992,7 +366,7 @@
         <w:pStyle w:val="ListParagraph"/>
         <w:numPr>
           <w:ilvl w:val="0"/>
-          <w:numId w:val="5"/>
+          <w:numId w:val="11"/>
         </w:numPr>
         <w:rPr>
           <w:sz w:val="20"/>
@@ -1001,10 +375,19 @@
       </w:pPr>
       <w:r>
         <w:rPr>
-          <w:sz w:val="20"/>
-          <w:szCs w:val="20"/>
-        </w:rPr>
-        <w:t>Deploy/demo URL</w:t>
+          <w:b/>
+          <w:bCs/>
+          <w:sz w:val="20"/>
+          <w:szCs w:val="20"/>
+        </w:rPr>
+        <w:t>Title</w:t>
+      </w:r>
+      <w:r>
+        <w:rPr>
+          <w:sz w:val="20"/>
+          <w:szCs w:val="20"/>
+        </w:rPr>
+        <w:t> (short, specific)</w:t>
       </w:r>
     </w:p>
     <w:p>
@@ -1012,7 +395,7 @@
         <w:pStyle w:val="ListParagraph"/>
         <w:numPr>
           <w:ilvl w:val="0"/>
-          <w:numId w:val="5"/>
+          <w:numId w:val="11"/>
         </w:numPr>
         <w:rPr>
           <w:sz w:val="20"/>
@@ -1021,10 +404,19 @@
       </w:pPr>
       <w:r>
         <w:rPr>
-          <w:sz w:val="20"/>
-          <w:szCs w:val="20"/>
-        </w:rPr>
-        <w:t xml:space="preserve">1–3 screenshots or ≤2-minute demo clip </w:t>
+          <w:b/>
+          <w:bCs/>
+          <w:sz w:val="20"/>
+          <w:szCs w:val="20"/>
+        </w:rPr>
+        <w:t>Status</w:t>
+      </w:r>
+      <w:r>
+        <w:rPr>
+          <w:sz w:val="20"/>
+          <w:szCs w:val="20"/>
+        </w:rPr>
+        <w:t> (done / partial / not done) or a clear %</w:t>
       </w:r>
     </w:p>
     <w:p>
@@ -1032,7 +424,7 @@
         <w:pStyle w:val="ListParagraph"/>
         <w:numPr>
           <w:ilvl w:val="0"/>
-          <w:numId w:val="5"/>
+          <w:numId w:val="11"/>
         </w:numPr>
         <w:rPr>
           <w:sz w:val="20"/>
@@ -1041,62 +433,35 @@
       </w:pPr>
       <w:r>
         <w:rPr>
-          <w:sz w:val="20"/>
-          <w:szCs w:val="20"/>
-        </w:rPr>
-        <w:t>CI/build status (badge or link) or brief test summary (e.g., total tests, failures, coverage ±Δ, manual/</w:t>
-      </w:r>
-      <w:r>
-        <w:rPr>
-          <w:sz w:val="20"/>
-          <w:szCs w:val="20"/>
-        </w:rPr>
-        <w:t>qualitative</w:t>
-      </w:r>
-      <w:r>
-        <w:rPr>
-          <w:sz w:val="20"/>
-          <w:szCs w:val="20"/>
-        </w:rPr>
-        <w:t>)</w:t>
-      </w:r>
-    </w:p>
-    <w:p>
-      <w:pPr>
-        <w:rPr>
-          <w:sz w:val="20"/>
-          <w:szCs w:val="20"/>
-        </w:rPr>
-      </w:pPr>
-      <w:r>
-        <w:rPr>
-          <w:sz w:val="20"/>
-          <w:szCs w:val="20"/>
-        </w:rPr>
-        <w:t>Indicate the commit hash used for the deployment/demo/screenshots/testing.</w:t>
-      </w:r>
-    </w:p>
-    <w:p>
-      <w:pPr>
-        <w:pStyle w:val="Heading1"/>
-        <w:rPr>
-          <w:sz w:val="32"/>
-          <w:szCs w:val="32"/>
-        </w:rPr>
-      </w:pPr>
-      <w:r>
-        <w:rPr>
-          <w:sz w:val="32"/>
-          <w:szCs w:val="32"/>
-        </w:rPr>
-        <w:t xml:space="preserve">4. </w:t>
-      </w:r>
-      <w:r>
-        <w:rPr>
-          <w:sz w:val="32"/>
-          <w:szCs w:val="32"/>
-        </w:rPr>
-        <w:t>Risk and Quality</w:t>
+          <w:b/>
+          <w:bCs/>
+          <w:sz w:val="20"/>
+          <w:szCs w:val="20"/>
+        </w:rPr>
+        <w:t>Owner</w:t>
+      </w:r>
+      <w:r>
+        <w:rPr>
+          <w:sz w:val="20"/>
+          <w:szCs w:val="20"/>
+        </w:rPr>
+        <w:t xml:space="preserve"> / </w:t>
+      </w:r>
+      <w:r>
+        <w:rPr>
+          <w:b/>
+          <w:bCs/>
+          <w:sz w:val="20"/>
+          <w:szCs w:val="20"/>
+        </w:rPr>
+        <w:t>Author</w:t>
+      </w:r>
+      <w:r>
+        <w:rPr>
+          <w:sz w:val="20"/>
+          <w:szCs w:val="20"/>
+        </w:rPr>
+        <w:t> (who did the primary work)</w:t>
       </w:r>
     </w:p>
     <w:p>
@@ -1104,7 +469,7 @@
         <w:pStyle w:val="ListParagraph"/>
         <w:numPr>
           <w:ilvl w:val="0"/>
-          <w:numId w:val="6"/>
+          <w:numId w:val="11"/>
         </w:numPr>
         <w:rPr>
           <w:sz w:val="20"/>
@@ -1113,10 +478,109 @@
       </w:pPr>
       <w:r>
         <w:rPr>
-          <w:sz w:val="20"/>
-          <w:szCs w:val="20"/>
-        </w:rPr>
-        <w:t>Top 2–3 active risks, each with:</w:t>
+          <w:b/>
+          <w:bCs/>
+          <w:sz w:val="20"/>
+          <w:szCs w:val="20"/>
+        </w:rPr>
+        <w:t>Reviewer</w:t>
+      </w:r>
+      <w:r>
+        <w:rPr>
+          <w:sz w:val="20"/>
+          <w:szCs w:val="20"/>
+        </w:rPr>
+        <w:t xml:space="preserve">(s) / </w:t>
+      </w:r>
+      <w:r>
+        <w:rPr>
+          <w:b/>
+          <w:bCs/>
+          <w:sz w:val="20"/>
+          <w:szCs w:val="20"/>
+        </w:rPr>
+        <w:t>Collaborator</w:t>
+      </w:r>
+      <w:r>
+        <w:rPr>
+          <w:sz w:val="20"/>
+          <w:szCs w:val="20"/>
+        </w:rPr>
+        <w:t>(s) (if applicable)</w:t>
+      </w:r>
+    </w:p>
+    <w:p>
+      <w:pPr>
+        <w:pStyle w:val="ListParagraph"/>
+        <w:numPr>
+          <w:ilvl w:val="0"/>
+          <w:numId w:val="11"/>
+        </w:numPr>
+        <w:rPr>
+          <w:sz w:val="20"/>
+          <w:szCs w:val="20"/>
+        </w:rPr>
+      </w:pPr>
+      <w:r>
+        <w:rPr>
+          <w:b/>
+          <w:bCs/>
+          <w:sz w:val="20"/>
+          <w:szCs w:val="20"/>
+        </w:rPr>
+        <w:t>Source link</w:t>
+      </w:r>
+      <w:r>
+        <w:rPr>
+          <w:sz w:val="20"/>
+          <w:szCs w:val="20"/>
+        </w:rPr>
+        <w:t xml:space="preserve"> (issue, task, PR, sprint plan item, requirement, test, ADR, or </w:t>
+      </w:r>
+      <w:proofErr w:type="spellStart"/>
+      <w:r>
+        <w:rPr>
+          <w:sz w:val="20"/>
+          <w:szCs w:val="20"/>
+        </w:rPr>
+        <w:t>doumentation</w:t>
+      </w:r>
+      <w:proofErr w:type="spellEnd"/>
+      <w:r>
+        <w:rPr>
+          <w:sz w:val="20"/>
+          <w:szCs w:val="20"/>
+        </w:rPr>
+        <w:t>, i.e., something trackable)</w:t>
+      </w:r>
+    </w:p>
+    <w:p>
+      <w:pPr>
+        <w:pStyle w:val="ListParagraph"/>
+        <w:numPr>
+          <w:ilvl w:val="0"/>
+          <w:numId w:val="11"/>
+        </w:numPr>
+        <w:rPr>
+          <w:sz w:val="20"/>
+          <w:szCs w:val="20"/>
+        </w:rPr>
+      </w:pPr>
+      <w:r>
+        <w:rPr>
+          <w:b/>
+          <w:bCs/>
+          <w:sz w:val="20"/>
+          <w:szCs w:val="20"/>
+        </w:rPr>
+        <w:t>Supporting artifact</w:t>
+      </w:r>
+      <w:r>
+        <w:rPr>
+          <w:sz w:val="20"/>
+          <w:szCs w:val="20"/>
+        </w:rPr>
+        <w:t> (at least one verifiable artifact)</w:t>
       </w:r>
     </w:p>
     <w:p>
@@ -1124,7 +588,7 @@
         <w:pStyle w:val="ListParagraph"/>
         <w:numPr>
           <w:ilvl w:val="1"/>
-          <w:numId w:val="6"/>
+          <w:numId w:val="11"/>
         </w:numPr>
         <w:rPr>
           <w:sz w:val="20"/>
@@ -1136,7 +600,7 @@
           <w:sz w:val="20"/>
           <w:szCs w:val="20"/>
         </w:rPr>
-        <w:t>owner</w:t>
+        <w:t>Deploy URL, screenshots, demo clip</w:t>
       </w:r>
     </w:p>
     <w:p>
@@ -1144,29 +608,67 @@
         <w:pStyle w:val="ListParagraph"/>
         <w:numPr>
           <w:ilvl w:val="1"/>
-          <w:numId w:val="6"/>
+          <w:numId w:val="11"/>
         </w:numPr>
         <w:rPr>
           <w:sz w:val="20"/>
           <w:szCs w:val="20"/>
         </w:rPr>
       </w:pPr>
-      <w:proofErr w:type="gramStart"/>
-      <w:r>
-        <w:rPr>
-          <w:sz w:val="20"/>
-          <w:szCs w:val="20"/>
-        </w:rPr>
-        <w:t>current status</w:t>
-      </w:r>
-      <w:proofErr w:type="gramEnd"/>
+      <w:r>
+        <w:rPr>
+          <w:sz w:val="20"/>
+          <w:szCs w:val="20"/>
+        </w:rPr>
+        <w:t>CI/build status or brief test summary</w:t>
+      </w:r>
+    </w:p>
+    <w:p>
+      <w:pPr>
+        <w:pStyle w:val="ListParagraph"/>
+        <w:numPr>
+          <w:ilvl w:val="1"/>
+          <w:numId w:val="11"/>
+        </w:numPr>
+        <w:rPr>
+          <w:sz w:val="20"/>
+          <w:szCs w:val="20"/>
+        </w:rPr>
+      </w:pPr>
+      <w:r>
+        <w:rPr>
+          <w:sz w:val="20"/>
+          <w:szCs w:val="20"/>
+        </w:rPr>
+        <w:t>Write-up artifacts (ADR, design doc, spike results, interview summary, decision log)</w:t>
+      </w:r>
+    </w:p>
+    <w:p>
+      <w:pPr>
+        <w:pStyle w:val="ListParagraph"/>
+        <w:numPr>
+          <w:ilvl w:val="1"/>
+          <w:numId w:val="11"/>
+        </w:numPr>
+        <w:rPr>
+          <w:sz w:val="20"/>
+          <w:szCs w:val="20"/>
+        </w:rPr>
+      </w:pPr>
+      <w:r>
+        <w:rPr>
+          <w:sz w:val="20"/>
+          <w:szCs w:val="20"/>
+        </w:rPr>
+        <w:t>Diagrams/specifications</w:t>
+      </w:r>
     </w:p>
     <w:p>
       <w:pPr>
         <w:pStyle w:val="ListParagraph"/>
         <w:numPr>
           <w:ilvl w:val="0"/>
-          <w:numId w:val="6"/>
+          <w:numId w:val="11"/>
         </w:numPr>
         <w:rPr>
           <w:sz w:val="20"/>
@@ -1175,24 +677,119 @@
       </w:pPr>
       <w:r>
         <w:rPr>
-          <w:sz w:val="20"/>
-          <w:szCs w:val="20"/>
-        </w:rPr>
-        <w:t>Bug</w:t>
-      </w:r>
-      <w:r>
-        <w:rPr>
-          <w:sz w:val="20"/>
-          <w:szCs w:val="20"/>
-        </w:rPr>
-        <w:t>/</w:t>
-      </w:r>
-      <w:r>
-        <w:rPr>
-          <w:sz w:val="20"/>
-          <w:szCs w:val="20"/>
-        </w:rPr>
-        <w:t xml:space="preserve">test metrics: counts, link to relevant issues/tasks, severity if relevant, failures, flaky tests, missing coverage, etc. </w:t>
+          <w:b/>
+          <w:bCs/>
+          <w:sz w:val="20"/>
+          <w:szCs w:val="20"/>
+        </w:rPr>
+        <w:t>Notes</w:t>
+      </w:r>
+      <w:r>
+        <w:rPr>
+          <w:sz w:val="20"/>
+          <w:szCs w:val="20"/>
+        </w:rPr>
+        <w:t> (optional): blockers, plan changes, or what remains</w:t>
+      </w:r>
+    </w:p>
+    <w:p>
+      <w:pPr>
+        <w:rPr>
+          <w:sz w:val="20"/>
+          <w:szCs w:val="20"/>
+        </w:rPr>
+      </w:pPr>
+      <w:r>
+        <w:rPr>
+          <w:i/>
+          <w:iCs/>
+          <w:sz w:val="20"/>
+          <w:szCs w:val="20"/>
+        </w:rPr>
+        <w:t>One artifact may cover multiple work items</w:t>
+      </w:r>
+      <w:r>
+        <w:rPr>
+          <w:sz w:val="20"/>
+          <w:szCs w:val="20"/>
+        </w:rPr>
+        <w:t xml:space="preserve"> (e.g., one demo clip shows several features), </w:t>
+      </w:r>
+      <w:proofErr w:type="gramStart"/>
+      <w:r>
+        <w:rPr>
+          <w:sz w:val="20"/>
+          <w:szCs w:val="20"/>
+        </w:rPr>
+        <w:t>as long as</w:t>
+      </w:r>
+      <w:proofErr w:type="gramEnd"/>
+      <w:r>
+        <w:rPr>
+          <w:sz w:val="20"/>
+          <w:szCs w:val="20"/>
+        </w:rPr>
+        <w:t xml:space="preserve"> you clearly say which items it covers.</w:t>
+      </w:r>
+    </w:p>
+    <w:p>
+      <w:pPr>
+        <w:rPr>
+          <w:sz w:val="20"/>
+          <w:szCs w:val="20"/>
+        </w:rPr>
+      </w:pPr>
+      <w:r>
+        <w:rPr>
+          <w:sz w:val="20"/>
+          <w:szCs w:val="20"/>
+        </w:rPr>
+        <w:t>If an artifact corresponds to a code state, include the relevant commit hash(es). If an artifact is a write-up, include a stable link and enough context to evaluate it (title/date/version/location).</w:t>
+      </w:r>
+    </w:p>
+    <w:p>
+      <w:pPr>
+        <w:pStyle w:val="Heading1"/>
+        <w:rPr>
+          <w:sz w:val="32"/>
+          <w:szCs w:val="32"/>
+        </w:rPr>
+      </w:pPr>
+      <w:r>
+        <w:rPr>
+          <w:sz w:val="32"/>
+          <w:szCs w:val="32"/>
+        </w:rPr>
+        <w:t>3</w:t>
+      </w:r>
+      <w:r>
+        <w:rPr>
+          <w:sz w:val="32"/>
+          <w:szCs w:val="32"/>
+        </w:rPr>
+        <w:t xml:space="preserve">. </w:t>
+      </w:r>
+      <w:r>
+        <w:rPr>
+          <w:sz w:val="32"/>
+          <w:szCs w:val="32"/>
+        </w:rPr>
+        <w:t>Risk and Quality</w:t>
+      </w:r>
+    </w:p>
+    <w:p>
+      <w:pPr>
+        <w:rPr>
+          <w:sz w:val="20"/>
+          <w:szCs w:val="20"/>
+        </w:rPr>
+      </w:pPr>
+      <w:r>
+        <w:rPr>
+          <w:sz w:val="20"/>
+          <w:szCs w:val="20"/>
+        </w:rPr>
+        <w:t>List the number of recorded bugs currently open and the highest-impact open bugs.</w:t>
       </w:r>
     </w:p>
     <w:p>
@@ -1200,7 +797,7 @@
         <w:pStyle w:val="ListParagraph"/>
         <w:numPr>
           <w:ilvl w:val="0"/>
-          <w:numId w:val="6"/>
+          <w:numId w:val="9"/>
         </w:numPr>
         <w:rPr>
           <w:sz w:val="20"/>
@@ -1212,11 +809,145 @@
           <w:sz w:val="20"/>
           <w:szCs w:val="20"/>
         </w:rPr>
-        <w:t>Concrete actions</w:t>
+        <w:t>Bug count (1 line): Open bugs now = [N]. Include a link to your bug list / issue query.</w:t>
       </w:r>
     </w:p>
     <w:p>
       <w:pPr>
+        <w:pStyle w:val="ListParagraph"/>
+        <w:numPr>
+          <w:ilvl w:val="0"/>
+          <w:numId w:val="9"/>
+        </w:numPr>
+        <w:rPr>
+          <w:sz w:val="20"/>
+          <w:szCs w:val="20"/>
+        </w:rPr>
+      </w:pPr>
+      <w:r>
+        <w:rPr>
+          <w:sz w:val="20"/>
+          <w:szCs w:val="20"/>
+        </w:rPr>
+        <w:t>Top bugs (3-5 items): list your highest-impact open bugs.</w:t>
+      </w:r>
+    </w:p>
+    <w:p>
+      <w:pPr>
+        <w:pStyle w:val="ListParagraph"/>
+        <w:numPr>
+          <w:ilvl w:val="0"/>
+          <w:numId w:val="9"/>
+        </w:numPr>
+        <w:rPr>
+          <w:sz w:val="20"/>
+          <w:szCs w:val="20"/>
+        </w:rPr>
+      </w:pPr>
+      <w:r>
+        <w:rPr>
+          <w:sz w:val="20"/>
+          <w:szCs w:val="20"/>
+        </w:rPr>
+        <w:t>Each bug must include</w:t>
+      </w:r>
+      <w:r>
+        <w:rPr>
+          <w:sz w:val="20"/>
+          <w:szCs w:val="20"/>
+        </w:rPr>
+        <w:t xml:space="preserve"> </w:t>
+      </w:r>
+      <w:r>
+        <w:rPr>
+          <w:sz w:val="20"/>
+          <w:szCs w:val="20"/>
+        </w:rPr>
+        <w:t xml:space="preserve">severity/impact, owner, </w:t>
+      </w:r>
+      <w:proofErr w:type="gramStart"/>
+      <w:r>
+        <w:rPr>
+          <w:sz w:val="20"/>
+          <w:szCs w:val="20"/>
+        </w:rPr>
+        <w:t>current status</w:t>
+      </w:r>
+      <w:proofErr w:type="gramEnd"/>
+      <w:r>
+        <w:rPr>
+          <w:sz w:val="20"/>
+          <w:szCs w:val="20"/>
+        </w:rPr>
+        <w:t>, and a link.</w:t>
+      </w:r>
+    </w:p>
+    <w:p>
+      <w:pPr>
+        <w:pStyle w:val="ListParagraph"/>
+        <w:numPr>
+          <w:ilvl w:val="0"/>
+          <w:numId w:val="9"/>
+        </w:numPr>
+        <w:rPr>
+          <w:sz w:val="20"/>
+          <w:szCs w:val="20"/>
+        </w:rPr>
+      </w:pPr>
+      <w:r>
+        <w:rPr>
+          <w:sz w:val="20"/>
+          <w:szCs w:val="20"/>
+        </w:rPr>
+        <w:t>Actions: assign a concrete next step for the top 2-3 bugs (who does what by when).</w:t>
+      </w:r>
+    </w:p>
+    <w:p>
+      <w:pPr>
+        <w:rPr>
+          <w:sz w:val="15"/>
+          <w:szCs w:val="15"/>
+        </w:rPr>
+      </w:pPr>
+      <w:r>
+        <w:rPr>
+          <w:rStyle w:val="Strong"/>
+          <w:color w:val="273540"/>
+          <w:sz w:val="20"/>
+          <w:szCs w:val="20"/>
+          <w:shd w:val="clear" w:color="auto" w:fill="FFFFFF"/>
+        </w:rPr>
+        <w:t>If you truly have no bugs:</w:t>
+      </w:r>
+      <w:r>
+        <w:rPr>
+          <w:sz w:val="20"/>
+          <w:szCs w:val="20"/>
+          <w:shd w:val="clear" w:color="auto" w:fill="FFFFFF"/>
+        </w:rPr>
+        <w:t> write </w:t>
+      </w:r>
+      <w:r>
+        <w:rPr>
+          <w:rStyle w:val="Strong"/>
+          <w:color w:val="273540"/>
+          <w:sz w:val="20"/>
+          <w:szCs w:val="20"/>
+          <w:shd w:val="clear" w:color="auto" w:fill="FFFFFF"/>
+        </w:rPr>
+        <w:t>“No known bugs”</w:t>
+      </w:r>
+      <w:r>
+        <w:rPr>
+          <w:sz w:val="20"/>
+          <w:szCs w:val="20"/>
+          <w:shd w:val="clear" w:color="auto" w:fill="FFFFFF"/>
+        </w:rPr>
+        <w:t> and link to where you track issues, plus 1 sentence describing what you did to check (e.g., manual test pass, demo run-through, CI green).</w:t>
+      </w:r>
+    </w:p>
+    <w:p>
+      <w:pPr>
         <w:pStyle w:val="Heading1"/>
         <w:rPr>
           <w:sz w:val="32"/>
@@ -1228,14 +959,29 @@
           <w:sz w:val="32"/>
           <w:szCs w:val="32"/>
         </w:rPr>
-        <w:t xml:space="preserve">5. </w:t>
+        <w:lastRenderedPageBreak/>
+        <w:t>4</w:t>
       </w:r>
       <w:r>
         <w:rPr>
           <w:sz w:val="32"/>
           <w:szCs w:val="32"/>
         </w:rPr>
-        <w:t>Next Goals</w:t>
+        <w:t xml:space="preserve">. </w:t>
+      </w:r>
+      <w:r>
+        <w:rPr>
+          <w:sz w:val="32"/>
+          <w:szCs w:val="32"/>
+        </w:rPr>
+        <w:t xml:space="preserve">Next </w:t>
+      </w:r>
+      <w:r>
+        <w:rPr>
+          <w:sz w:val="32"/>
+          <w:szCs w:val="32"/>
+        </w:rPr>
+        <w:t>Sprint Plan</w:t>
       </w:r>
     </w:p>
     <w:p>
@@ -1250,18 +996,90 @@
           <w:sz w:val="20"/>
           <w:szCs w:val="20"/>
         </w:rPr>
-        <w:t>3-5 goals, each tied to a requirement/test ID</w:t>
-      </w:r>
-      <w:r>
-        <w:rPr>
-          <w:sz w:val="20"/>
-          <w:szCs w:val="20"/>
-        </w:rPr>
-        <w:t>/issue/task.</w:t>
+        <w:t>List the most important next sprint work items (</w:t>
+      </w:r>
+      <w:r>
+        <w:rPr>
+          <w:b/>
+          <w:bCs/>
+          <w:sz w:val="20"/>
+          <w:szCs w:val="20"/>
+        </w:rPr>
+        <w:t>3-5 items</w:t>
+      </w:r>
+      <w:r>
+        <w:rPr>
+          <w:sz w:val="20"/>
+          <w:szCs w:val="20"/>
+        </w:rPr>
+        <w:t>). These do </w:t>
+      </w:r>
+      <w:r>
+        <w:rPr>
+          <w:b/>
+          <w:bCs/>
+          <w:sz w:val="20"/>
+          <w:szCs w:val="20"/>
+        </w:rPr>
+        <w:t>not</w:t>
+      </w:r>
+      <w:r>
+        <w:rPr>
+          <w:sz w:val="20"/>
+          <w:szCs w:val="20"/>
+        </w:rPr>
+        <w:t xml:space="preserve"> have to be requirements—they can be </w:t>
+      </w:r>
+      <w:proofErr w:type="gramStart"/>
+      <w:r>
+        <w:rPr>
+          <w:sz w:val="20"/>
+          <w:szCs w:val="20"/>
+        </w:rPr>
+        <w:t>bug</w:t>
+      </w:r>
+      <w:proofErr w:type="gramEnd"/>
+      <w:r>
+        <w:rPr>
+          <w:sz w:val="20"/>
+          <w:szCs w:val="20"/>
+        </w:rPr>
+        <w:t xml:space="preserve"> fixes, infrastructure work, stakeholder/marketing/outreach tasks, research/spikes, documentation, or anything else that produces a measurable outcome.</w:t>
       </w:r>
     </w:p>
     <w:p>
       <w:pPr>
+        <w:rPr>
+          <w:sz w:val="20"/>
+          <w:szCs w:val="20"/>
+        </w:rPr>
+      </w:pPr>
+      <w:r>
+        <w:rPr>
+          <w:sz w:val="20"/>
+          <w:szCs w:val="20"/>
+        </w:rPr>
+        <w:t xml:space="preserve">Each item must include a link to a verifiable source of truth, such as a requirement ID, test ID, GitHub issue/task, ADR/design doc, marketing plan doc, or other trackable artifact. This supports traceability and makes planning </w:t>
+      </w:r>
+      <w:proofErr w:type="spellStart"/>
+      <w:r>
+        <w:rPr>
+          <w:sz w:val="20"/>
+          <w:szCs w:val="20"/>
+        </w:rPr>
+        <w:t>gradeable</w:t>
+      </w:r>
+      <w:proofErr w:type="spellEnd"/>
+      <w:r>
+        <w:rPr>
+          <w:sz w:val="20"/>
+          <w:szCs w:val="20"/>
+        </w:rPr>
+        <w:t>.</w:t>
+      </w:r>
+    </w:p>
+    <w:p>
+      <w:pPr>
         <w:pStyle w:val="Heading1"/>
         <w:rPr>
           <w:sz w:val="32"/>
@@ -1273,7 +1091,14 @@
           <w:sz w:val="32"/>
           <w:szCs w:val="32"/>
         </w:rPr>
-        <w:t>6. Team Process Reflection</w:t>
+        <w:t>5</w:t>
+      </w:r>
+      <w:r>
+        <w:rPr>
+          <w:sz w:val="32"/>
+          <w:szCs w:val="32"/>
+        </w:rPr>
+        <w:t>. Team Process Reflection</w:t>
       </w:r>
     </w:p>
     <w:p>
@@ -1288,6 +1113,15 @@
           <w:sz w:val="20"/>
           <w:szCs w:val="20"/>
         </w:rPr>
+        <w:t>Write </w:t>
+      </w:r>
+      <w:r>
+        <w:rPr>
+          <w:b/>
+          <w:bCs/>
+          <w:sz w:val="20"/>
+          <w:szCs w:val="20"/>
+        </w:rPr>
         <w:t>3-5 sentences</w:t>
       </w:r>
       <w:r>
@@ -1295,53 +1129,87 @@
           <w:sz w:val="20"/>
           <w:szCs w:val="20"/>
         </w:rPr>
-        <w:t>, what worked, what did not, actionable improvements, evidence of success for next sprint</w:t>
+        <w:t> reflecting on:</w:t>
       </w:r>
     </w:p>
     <w:p>
       <w:pPr>
-        <w:pStyle w:val="Heading1"/>
-        <w:rPr>
-          <w:sz w:val="32"/>
-          <w:szCs w:val="32"/>
-        </w:rPr>
-      </w:pPr>
-      <w:r>
-        <w:rPr>
-          <w:sz w:val="32"/>
-          <w:szCs w:val="32"/>
-        </w:rPr>
-        <w:lastRenderedPageBreak/>
-        <w:t xml:space="preserve">7. </w:t>
-      </w:r>
-      <w:r>
-        <w:rPr>
-          <w:sz w:val="32"/>
-          <w:szCs w:val="32"/>
-        </w:rPr>
-        <w:t>Individual Contributions</w:t>
+        <w:pStyle w:val="ListParagraph"/>
+        <w:numPr>
+          <w:ilvl w:val="0"/>
+          <w:numId w:val="13"/>
+        </w:numPr>
+        <w:rPr>
+          <w:sz w:val="20"/>
+          <w:szCs w:val="20"/>
+        </w:rPr>
+      </w:pPr>
+      <w:r>
+        <w:rPr>
+          <w:sz w:val="20"/>
+          <w:szCs w:val="20"/>
+        </w:rPr>
+        <w:t>What worked</w:t>
       </w:r>
     </w:p>
     <w:p>
       <w:pPr>
-        <w:rPr>
-          <w:sz w:val="20"/>
-          <w:szCs w:val="20"/>
-        </w:rPr>
-      </w:pPr>
-      <w:r>
-        <w:rPr>
-          <w:sz w:val="20"/>
-          <w:szCs w:val="20"/>
-        </w:rPr>
-        <w:t>Bullets per member with links to PRs/reviews/issues</w:t>
-      </w:r>
-      <w:r>
-        <w:rPr>
-          <w:sz w:val="20"/>
-          <w:szCs w:val="20"/>
-        </w:rPr>
-        <w:t xml:space="preserve">/other contributions. </w:t>
+        <w:pStyle w:val="ListParagraph"/>
+        <w:numPr>
+          <w:ilvl w:val="0"/>
+          <w:numId w:val="13"/>
+        </w:numPr>
+        <w:rPr>
+          <w:sz w:val="20"/>
+          <w:szCs w:val="20"/>
+        </w:rPr>
+      </w:pPr>
+      <w:r>
+        <w:rPr>
+          <w:sz w:val="20"/>
+          <w:szCs w:val="20"/>
+        </w:rPr>
+        <w:t>What didn’t</w:t>
+      </w:r>
+    </w:p>
+    <w:p>
+      <w:pPr>
+        <w:pStyle w:val="ListParagraph"/>
+        <w:numPr>
+          <w:ilvl w:val="0"/>
+          <w:numId w:val="13"/>
+        </w:numPr>
+        <w:rPr>
+          <w:sz w:val="20"/>
+          <w:szCs w:val="20"/>
+        </w:rPr>
+      </w:pPr>
+      <w:r>
+        <w:rPr>
+          <w:sz w:val="20"/>
+          <w:szCs w:val="20"/>
+        </w:rPr>
+        <w:t>One or two actionable improvements</w:t>
+      </w:r>
+    </w:p>
+    <w:p>
+      <w:pPr>
+        <w:pStyle w:val="ListParagraph"/>
+        <w:numPr>
+          <w:ilvl w:val="0"/>
+          <w:numId w:val="13"/>
+        </w:numPr>
+        <w:rPr>
+          <w:sz w:val="20"/>
+          <w:szCs w:val="20"/>
+        </w:rPr>
+      </w:pPr>
+      <w:r>
+        <w:rPr>
+          <w:sz w:val="20"/>
+          <w:szCs w:val="20"/>
+        </w:rPr>
+        <w:t>What evidence will show the improvements worked</w:t>
       </w:r>
     </w:p>
     <w:sectPr>
@@ -1570,6 +1438,268 @@
 <file path=word/numbering.xml><?xml version="1.0" encoding="utf-8"?>
 <w:numbering xmlns:wpc="http://schemas.microsoft.com/office/word/2010/wordprocessingCanvas" xmlns:cx="http://schemas.microsoft.com/office/drawing/2014/chartex" xmlns:cx1="http://schemas.microsoft.com/office/drawing/2015/9/8/chartex" xmlns:cx2="http://schemas.microsoft.com/office/drawing/2015/10/21/chartex" xmlns:cx3="http://schemas.microsoft.com/office/drawing/2016/5/9/chartex" xmlns:cx4="http://schemas.microsoft.com/office/drawing/2016/5/10/chartex" xmlns:cx5="http://schemas.microsoft.com/office/drawing/2016/5/11/chartex" xmlns:cx6="http://schemas.microsoft.com/office/drawing/2016/5/12/chartex" xmlns:cx7="http://schemas.microsoft.com/office/drawing/2016/5/13/chartex" xmlns:cx8="http://schemas.microsoft.com/office/drawing/2016/5/14/chartex" xmlns:mc="http://schemas.openxmlformats.org/markup-compatibility/2006" xmlns:aink="http://schemas.microsoft.com/office/drawing/2016/ink" xmlns:am3d="http://schemas.microsoft.com/office/drawing/2017/model3d" xmlns:o="urn:schemas-microsoft-com:office:office" xmlns:oel="http://schemas.microsoft.com/office/2019/extlst" xmlns:r="http://schemas.openxmlformats.org/officeDocument/2006/relationships" xmlns:m="http://schemas.openxmlformats.org/officeDocument/2006/math" xmlns:v="urn:schemas-microsoft-com:vml" xmlns:wp14="http://schemas.microsoft.com/office/word/2010/wordprocessingDrawing" xmlns:wp="http://schemas.openxmlformats.org/drawingml/2006/wordprocessingDrawing" xmlns:w10="urn:schemas-microsoft-com:office:word" xmlns:w="http://schemas.openxmlformats.org/wordprocessingml/2006/main" xmlns:w14="http://schemas.microsoft.com/office/word/2010/wordml" xmlns:w15="http://schemas.microsoft.com/office/word/2012/wordml" xmlns:w16cex="http://schemas.microsoft.com/office/word/2018/wordml/cex" xmlns:w16cid="http://schemas.microsoft.com/office/word/2016/wordml/cid" xmlns:w16="http://schemas.microsoft.com/office/word/2018/wordml" xmlns:w16du="http://schemas.microsoft.com/office/word/2023/wordml/word16du" xmlns:w16sdtdh="http://schemas.microsoft.com/office/word/2020/wordml/sdtdatahash" xmlns:w16sdtfl="http://schemas.microsoft.com/office/word/2024/wordml/sdtformatlock" xmlns:w16se="http://schemas.microsoft.com/office/word/2015/wordml/symex" xmlns:wpg="http://schemas.microsoft.com/office/word/2010/wordprocessingGroup" xmlns:wpi="http://schemas.microsoft.com/office/word/2010/wordprocessingInk" xmlns:wne="http://schemas.microsoft.com/office/word/2006/wordml" xmlns:wps="http://schemas.microsoft.com/office/word/2010/wordprocessingShape" mc:Ignorable="w14 w15 w16se w16cid w16 w16cex w16sdtdh w16sdtfl w16du wp14">
   <w:abstractNum w:abstractNumId="0" w15:restartNumberingAfterBreak="0">
+    <w:nsid w:val="177F0E91"/>
+    <w:multiLevelType w:val="hybridMultilevel"/>
+    <w:tmpl w:val="EF9E0A92"/>
+    <w:lvl w:ilvl="0" w:tplc="04090001">
+      <w:start w:val="1"/>
+      <w:numFmt w:val="bullet"/>
+      <w:lvlText w:val=""/>
+      <w:lvlJc w:val="left"/>
+      <w:pPr>
+        <w:ind w:left="720" w:hanging="360"/>
+      </w:pPr>
+      <w:rPr>
+        <w:rFonts w:ascii="Symbol" w:hAnsi="Symbol" w:hint="default"/>
+      </w:rPr>
+    </w:lvl>
+    <w:lvl w:ilvl="1" w:tplc="04090003" w:tentative="1">
+      <w:start w:val="1"/>
+      <w:numFmt w:val="bullet"/>
+      <w:lvlText w:val="o"/>
+      <w:lvlJc w:val="left"/>
+      <w:pPr>
+        <w:ind w:left="1440" w:hanging="360"/>
+      </w:pPr>
+      <w:rPr>
+        <w:rFonts w:ascii="Courier New" w:hAnsi="Courier New" w:cs="Courier New" w:hint="default"/>
+      </w:rPr>
+    </w:lvl>
+    <w:lvl w:ilvl="2" w:tplc="04090005" w:tentative="1">
+      <w:start w:val="1"/>
+      <w:numFmt w:val="bullet"/>
+      <w:lvlText w:val=""/>
+      <w:lvlJc w:val="left"/>
+      <w:pPr>
+        <w:ind w:left="2160" w:hanging="360"/>
+      </w:pPr>
+      <w:rPr>
+        <w:rFonts w:ascii="Wingdings" w:hAnsi="Wingdings" w:hint="default"/>
+      </w:rPr>
+    </w:lvl>
+    <w:lvl w:ilvl="3" w:tplc="04090001" w:tentative="1">
+      <w:start w:val="1"/>
+      <w:numFmt w:val="bullet"/>
+      <w:lvlText w:val=""/>
+      <w:lvlJc w:val="left"/>
+      <w:pPr>
+        <w:ind w:left="2880" w:hanging="360"/>
+      </w:pPr>
+      <w:rPr>
+        <w:rFonts w:ascii="Symbol" w:hAnsi="Symbol" w:hint="default"/>
+      </w:rPr>
+    </w:lvl>
+    <w:lvl w:ilvl="4" w:tplc="04090003" w:tentative="1">
+      <w:start w:val="1"/>
+      <w:numFmt w:val="bullet"/>
+      <w:lvlText w:val="o"/>
+      <w:lvlJc w:val="left"/>
+      <w:pPr>
+        <w:ind w:left="3600" w:hanging="360"/>
+      </w:pPr>
+      <w:rPr>
+        <w:rFonts w:ascii="Courier New" w:hAnsi="Courier New" w:cs="Courier New" w:hint="default"/>
+      </w:rPr>
+    </w:lvl>
+    <w:lvl w:ilvl="5" w:tplc="04090005" w:tentative="1">
+      <w:start w:val="1"/>
+      <w:numFmt w:val="bullet"/>
+      <w:lvlText w:val=""/>
+      <w:lvlJc w:val="left"/>
+      <w:pPr>
+        <w:ind w:left="4320" w:hanging="360"/>
+      </w:pPr>
+      <w:rPr>
+        <w:rFonts w:ascii="Wingdings" w:hAnsi="Wingdings" w:hint="default"/>
+      </w:rPr>
+    </w:lvl>
+    <w:lvl w:ilvl="6" w:tplc="04090001" w:tentative="1">
+      <w:start w:val="1"/>
+      <w:numFmt w:val="bullet"/>
+      <w:lvlText w:val=""/>
+      <w:lvlJc w:val="left"/>
+      <w:pPr>
+        <w:ind w:left="5040" w:hanging="360"/>
+      </w:pPr>
+      <w:rPr>
+        <w:rFonts w:ascii="Symbol" w:hAnsi="Symbol" w:hint="default"/>
+      </w:rPr>
+    </w:lvl>
+    <w:lvl w:ilvl="7" w:tplc="04090003" w:tentative="1">
+      <w:start w:val="1"/>
+      <w:numFmt w:val="bullet"/>
+      <w:lvlText w:val="o"/>
+      <w:lvlJc w:val="left"/>
+      <w:pPr>
+        <w:ind w:left="5760" w:hanging="360"/>
+      </w:pPr>
+      <w:rPr>
+        <w:rFonts w:ascii="Courier New" w:hAnsi="Courier New" w:cs="Courier New" w:hint="default"/>
+      </w:rPr>
+    </w:lvl>
+    <w:lvl w:ilvl="8" w:tplc="04090005" w:tentative="1">
+      <w:start w:val="1"/>
+      <w:numFmt w:val="bullet"/>
+      <w:lvlText w:val=""/>
+      <w:lvlJc w:val="left"/>
+      <w:pPr>
+        <w:ind w:left="6480" w:hanging="360"/>
+      </w:pPr>
+      <w:rPr>
+        <w:rFonts w:ascii="Wingdings" w:hAnsi="Wingdings" w:hint="default"/>
+      </w:rPr>
+    </w:lvl>
+  </w:abstractNum>
+  <w:abstractNum w:abstractNumId="1" w15:restartNumberingAfterBreak="0">
+    <w:nsid w:val="1EA30CD8"/>
+    <w:multiLevelType w:val="multilevel"/>
+    <w:tmpl w:val="D638A900"/>
+    <w:lvl w:ilvl="0">
+      <w:start w:val="1"/>
+      <w:numFmt w:val="bullet"/>
+      <w:lvlText w:val=""/>
+      <w:lvlJc w:val="left"/>
+      <w:pPr>
+        <w:tabs>
+          <w:tab w:val="num" w:pos="720"/>
+        </w:tabs>
+        <w:ind w:left="720" w:hanging="360"/>
+      </w:pPr>
+      <w:rPr>
+        <w:rFonts w:ascii="Symbol" w:hAnsi="Symbol" w:hint="default"/>
+        <w:sz w:val="20"/>
+      </w:rPr>
+    </w:lvl>
+    <w:lvl w:ilvl="1">
+      <w:start w:val="1"/>
+      <w:numFmt w:val="bullet"/>
+      <w:lvlText w:val="o"/>
+      <w:lvlJc w:val="left"/>
+      <w:pPr>
+        <w:tabs>
+          <w:tab w:val="num" w:pos="1440"/>
+        </w:tabs>
+        <w:ind w:left="1440" w:hanging="360"/>
+      </w:pPr>
+      <w:rPr>
+        <w:rFonts w:ascii="Courier New" w:hAnsi="Courier New" w:hint="default"/>
+        <w:sz w:val="20"/>
+      </w:rPr>
+    </w:lvl>
+    <w:lvl w:ilvl="2" w:tentative="1">
+      <w:start w:val="1"/>
+      <w:numFmt w:val="bullet"/>
+      <w:lvlText w:val=""/>
+      <w:lvlJc w:val="left"/>
+      <w:pPr>
+        <w:tabs>
+          <w:tab w:val="num" w:pos="2160"/>
+        </w:tabs>
+        <w:ind w:left="2160" w:hanging="360"/>
+      </w:pPr>
+      <w:rPr>
+        <w:rFonts w:ascii="Wingdings" w:hAnsi="Wingdings" w:hint="default"/>
+        <w:sz w:val="20"/>
+      </w:rPr>
+    </w:lvl>
+    <w:lvl w:ilvl="3" w:tentative="1">
+      <w:start w:val="1"/>
+      <w:numFmt w:val="bullet"/>
+      <w:lvlText w:val=""/>
+      <w:lvlJc w:val="left"/>
+      <w:pPr>
+        <w:tabs>
+          <w:tab w:val="num" w:pos="2880"/>
+        </w:tabs>
+        <w:ind w:left="2880" w:hanging="360"/>
+      </w:pPr>
+      <w:rPr>
+        <w:rFonts w:ascii="Wingdings" w:hAnsi="Wingdings" w:hint="default"/>
+        <w:sz w:val="20"/>
+      </w:rPr>
+    </w:lvl>
+    <w:lvl w:ilvl="4" w:tentative="1">
+      <w:start w:val="1"/>
+      <w:numFmt w:val="bullet"/>
+      <w:lvlText w:val=""/>
+      <w:lvlJc w:val="left"/>
+      <w:pPr>
+        <w:tabs>
+          <w:tab w:val="num" w:pos="3600"/>
+        </w:tabs>
+        <w:ind w:left="3600" w:hanging="360"/>
+      </w:pPr>
+      <w:rPr>
+        <w:rFonts w:ascii="Wingdings" w:hAnsi="Wingdings" w:hint="default"/>
+        <w:sz w:val="20"/>
+      </w:rPr>
+    </w:lvl>
+    <w:lvl w:ilvl="5" w:tentative="1">
+      <w:start w:val="1"/>
+      <w:numFmt w:val="bullet"/>
+      <w:lvlText w:val=""/>
+      <w:lvlJc w:val="left"/>
+      <w:pPr>
+        <w:tabs>
+          <w:tab w:val="num" w:pos="4320"/>
+        </w:tabs>
+        <w:ind w:left="4320" w:hanging="360"/>
+      </w:pPr>
+      <w:rPr>
+        <w:rFonts w:ascii="Wingdings" w:hAnsi="Wingdings" w:hint="default"/>
+        <w:sz w:val="20"/>
+      </w:rPr>
+    </w:lvl>
+    <w:lvl w:ilvl="6" w:tentative="1">
+      <w:start w:val="1"/>
+      <w:numFmt w:val="bullet"/>
+      <w:lvlText w:val=""/>
+      <w:lvlJc w:val="left"/>
+      <w:pPr>
+        <w:tabs>
+          <w:tab w:val="num" w:pos="5040"/>
+        </w:tabs>
+        <w:ind w:left="5040" w:hanging="360"/>
+      </w:pPr>
+      <w:rPr>
+        <w:rFonts w:ascii="Wingdings" w:hAnsi="Wingdings" w:hint="default"/>
+        <w:sz w:val="20"/>
+      </w:rPr>
+    </w:lvl>
+    <w:lvl w:ilvl="7" w:tentative="1">
+      <w:start w:val="1"/>
+      <w:numFmt w:val="bullet"/>
+      <w:lvlText w:val=""/>
+      <w:lvlJc w:val="left"/>
+      <w:pPr>
+        <w:tabs>
+          <w:tab w:val="num" w:pos="5760"/>
+        </w:tabs>
+        <w:ind w:left="5760" w:hanging="360"/>
+      </w:pPr>
+      <w:rPr>
+        <w:rFonts w:ascii="Wingdings" w:hAnsi="Wingdings" w:hint="default"/>
+        <w:sz w:val="20"/>
+      </w:rPr>
+    </w:lvl>
+    <w:lvl w:ilvl="8" w:tentative="1">
+      <w:start w:val="1"/>
+      <w:numFmt w:val="bullet"/>
+      <w:lvlText w:val=""/>
+      <w:lvlJc w:val="left"/>
+      <w:pPr>
+        <w:tabs>
+          <w:tab w:val="num" w:pos="6480"/>
+        </w:tabs>
+        <w:ind w:left="6480" w:hanging="360"/>
+      </w:pPr>
+      <w:rPr>
+        <w:rFonts w:ascii="Wingdings" w:hAnsi="Wingdings" w:hint="default"/>
+        <w:sz w:val="20"/>
+      </w:rPr>
+    </w:lvl>
+  </w:abstractNum>
+  <w:abstractNum w:abstractNumId="2" w15:restartNumberingAfterBreak="0">
     <w:nsid w:val="2985108A"/>
     <w:multiLevelType w:val="hybridMultilevel"/>
     <w:tmpl w:val="BAEC9782"/>
@@ -1658,7 +1788,7 @@
       </w:pPr>
     </w:lvl>
   </w:abstractNum>
-  <w:abstractNum w:abstractNumId="1" w15:restartNumberingAfterBreak="0">
+  <w:abstractNum w:abstractNumId="3" w15:restartNumberingAfterBreak="0">
     <w:nsid w:val="334641DC"/>
     <w:multiLevelType w:val="multilevel"/>
     <w:tmpl w:val="A7981CA4"/>
@@ -1807,7 +1937,7 @@
       </w:rPr>
     </w:lvl>
   </w:abstractNum>
-  <w:abstractNum w:abstractNumId="2" w15:restartNumberingAfterBreak="0">
+  <w:abstractNum w:abstractNumId="4" w15:restartNumberingAfterBreak="0">
     <w:nsid w:val="41EB2199"/>
     <w:multiLevelType w:val="hybridMultilevel"/>
     <w:tmpl w:val="4C64FD72"/>
@@ -1920,7 +2050,233 @@
       </w:rPr>
     </w:lvl>
   </w:abstractNum>
-  <w:abstractNum w:abstractNumId="3" w15:restartNumberingAfterBreak="0">
+  <w:abstractNum w:abstractNumId="5" w15:restartNumberingAfterBreak="0">
+    <w:nsid w:val="42520640"/>
+    <w:multiLevelType w:val="hybridMultilevel"/>
+    <w:tmpl w:val="D2640448"/>
+    <w:lvl w:ilvl="0" w:tplc="04090001">
+      <w:start w:val="1"/>
+      <w:numFmt w:val="bullet"/>
+      <w:lvlText w:val=""/>
+      <w:lvlJc w:val="left"/>
+      <w:pPr>
+        <w:ind w:left="720" w:hanging="360"/>
+      </w:pPr>
+      <w:rPr>
+        <w:rFonts w:ascii="Symbol" w:hAnsi="Symbol" w:hint="default"/>
+      </w:rPr>
+    </w:lvl>
+    <w:lvl w:ilvl="1" w:tplc="04090003" w:tentative="1">
+      <w:start w:val="1"/>
+      <w:numFmt w:val="bullet"/>
+      <w:lvlText w:val="o"/>
+      <w:lvlJc w:val="left"/>
+      <w:pPr>
+        <w:ind w:left="1440" w:hanging="360"/>
+      </w:pPr>
+      <w:rPr>
+        <w:rFonts w:ascii="Courier New" w:hAnsi="Courier New" w:cs="Courier New" w:hint="default"/>
+      </w:rPr>
+    </w:lvl>
+    <w:lvl w:ilvl="2" w:tplc="04090005" w:tentative="1">
+      <w:start w:val="1"/>
+      <w:numFmt w:val="bullet"/>
+      <w:lvlText w:val=""/>
+      <w:lvlJc w:val="left"/>
+      <w:pPr>
+        <w:ind w:left="2160" w:hanging="360"/>
+      </w:pPr>
+      <w:rPr>
+        <w:rFonts w:ascii="Wingdings" w:hAnsi="Wingdings" w:hint="default"/>
+      </w:rPr>
+    </w:lvl>
+    <w:lvl w:ilvl="3" w:tplc="04090001" w:tentative="1">
+      <w:start w:val="1"/>
+      <w:numFmt w:val="bullet"/>
+      <w:lvlText w:val=""/>
+      <w:lvlJc w:val="left"/>
+      <w:pPr>
+        <w:ind w:left="2880" w:hanging="360"/>
+      </w:pPr>
+      <w:rPr>
+        <w:rFonts w:ascii="Symbol" w:hAnsi="Symbol" w:hint="default"/>
+      </w:rPr>
+    </w:lvl>
+    <w:lvl w:ilvl="4" w:tplc="04090003" w:tentative="1">
+      <w:start w:val="1"/>
+      <w:numFmt w:val="bullet"/>
+      <w:lvlText w:val="o"/>
+      <w:lvlJc w:val="left"/>
+      <w:pPr>
+        <w:ind w:left="3600" w:hanging="360"/>
+      </w:pPr>
+      <w:rPr>
+        <w:rFonts w:ascii="Courier New" w:hAnsi="Courier New" w:cs="Courier New" w:hint="default"/>
+      </w:rPr>
+    </w:lvl>
+    <w:lvl w:ilvl="5" w:tplc="04090005" w:tentative="1">
+      <w:start w:val="1"/>
+      <w:numFmt w:val="bullet"/>
+      <w:lvlText w:val=""/>
+      <w:lvlJc w:val="left"/>
+      <w:pPr>
+        <w:ind w:left="4320" w:hanging="360"/>
+      </w:pPr>
+      <w:rPr>
+        <w:rFonts w:ascii="Wingdings" w:hAnsi="Wingdings" w:hint="default"/>
+      </w:rPr>
+    </w:lvl>
+    <w:lvl w:ilvl="6" w:tplc="04090001" w:tentative="1">
+      <w:start w:val="1"/>
+      <w:numFmt w:val="bullet"/>
+      <w:lvlText w:val=""/>
+      <w:lvlJc w:val="left"/>
+      <w:pPr>
+        <w:ind w:left="5040" w:hanging="360"/>
+      </w:pPr>
+      <w:rPr>
+        <w:rFonts w:ascii="Symbol" w:hAnsi="Symbol" w:hint="default"/>
+      </w:rPr>
+    </w:lvl>
+    <w:lvl w:ilvl="7" w:tplc="04090003" w:tentative="1">
+      <w:start w:val="1"/>
+      <w:numFmt w:val="bullet"/>
+      <w:lvlText w:val="o"/>
+      <w:lvlJc w:val="left"/>
+      <w:pPr>
+        <w:ind w:left="5760" w:hanging="360"/>
+      </w:pPr>
+      <w:rPr>
+        <w:rFonts w:ascii="Courier New" w:hAnsi="Courier New" w:cs="Courier New" w:hint="default"/>
+      </w:rPr>
+    </w:lvl>
+    <w:lvl w:ilvl="8" w:tplc="04090005" w:tentative="1">
+      <w:start w:val="1"/>
+      <w:numFmt w:val="bullet"/>
+      <w:lvlText w:val=""/>
+      <w:lvlJc w:val="left"/>
+      <w:pPr>
+        <w:ind w:left="6480" w:hanging="360"/>
+      </w:pPr>
+      <w:rPr>
+        <w:rFonts w:ascii="Wingdings" w:hAnsi="Wingdings" w:hint="default"/>
+      </w:rPr>
+    </w:lvl>
+  </w:abstractNum>
+  <w:abstractNum w:abstractNumId="6" w15:restartNumberingAfterBreak="0">
+    <w:nsid w:val="452C58E8"/>
+    <w:multiLevelType w:val="hybridMultilevel"/>
+    <w:tmpl w:val="0BB2308E"/>
+    <w:lvl w:ilvl="0" w:tplc="04090001">
+      <w:start w:val="1"/>
+      <w:numFmt w:val="bullet"/>
+      <w:lvlText w:val=""/>
+      <w:lvlJc w:val="left"/>
+      <w:pPr>
+        <w:ind w:left="720" w:hanging="360"/>
+      </w:pPr>
+      <w:rPr>
+        <w:rFonts w:ascii="Symbol" w:hAnsi="Symbol" w:hint="default"/>
+      </w:rPr>
+    </w:lvl>
+    <w:lvl w:ilvl="1" w:tplc="04090003">
+      <w:start w:val="1"/>
+      <w:numFmt w:val="bullet"/>
+      <w:lvlText w:val="o"/>
+      <w:lvlJc w:val="left"/>
+      <w:pPr>
+        <w:ind w:left="1440" w:hanging="360"/>
+      </w:pPr>
+      <w:rPr>
+        <w:rFonts w:ascii="Courier New" w:hAnsi="Courier New" w:cs="Courier New" w:hint="default"/>
+      </w:rPr>
+    </w:lvl>
+    <w:lvl w:ilvl="2" w:tplc="04090005" w:tentative="1">
+      <w:start w:val="1"/>
+      <w:numFmt w:val="bullet"/>
+      <w:lvlText w:val=""/>
+      <w:lvlJc w:val="left"/>
+      <w:pPr>
+        <w:ind w:left="2160" w:hanging="360"/>
+      </w:pPr>
+      <w:rPr>
+        <w:rFonts w:ascii="Wingdings" w:hAnsi="Wingdings" w:hint="default"/>
+      </w:rPr>
+    </w:lvl>
+    <w:lvl w:ilvl="3" w:tplc="04090001" w:tentative="1">
+      <w:start w:val="1"/>
+      <w:numFmt w:val="bullet"/>
+      <w:lvlText w:val=""/>
+      <w:lvlJc w:val="left"/>
+      <w:pPr>
+        <w:ind w:left="2880" w:hanging="360"/>
+      </w:pPr>
+      <w:rPr>
+        <w:rFonts w:ascii="Symbol" w:hAnsi="Symbol" w:hint="default"/>
+      </w:rPr>
+    </w:lvl>
+    <w:lvl w:ilvl="4" w:tplc="04090003" w:tentative="1">
+      <w:start w:val="1"/>
+      <w:numFmt w:val="bullet"/>
+      <w:lvlText w:val="o"/>
+      <w:lvlJc w:val="left"/>
+      <w:pPr>
+        <w:ind w:left="3600" w:hanging="360"/>
+      </w:pPr>
+      <w:rPr>
+        <w:rFonts w:ascii="Courier New" w:hAnsi="Courier New" w:cs="Courier New" w:hint="default"/>
+      </w:rPr>
+    </w:lvl>
+    <w:lvl w:ilvl="5" w:tplc="04090005" w:tentative="1">
+      <w:start w:val="1"/>
+      <w:numFmt w:val="bullet"/>
+      <w:lvlText w:val=""/>
+      <w:lvlJc w:val="left"/>
+      <w:pPr>
+        <w:ind w:left="4320" w:hanging="360"/>
+      </w:pPr>
+      <w:rPr>
+        <w:rFonts w:ascii="Wingdings" w:hAnsi="Wingdings" w:hint="default"/>
+      </w:rPr>
+    </w:lvl>
+    <w:lvl w:ilvl="6" w:tplc="04090001" w:tentative="1">
+      <w:start w:val="1"/>
+      <w:numFmt w:val="bullet"/>
+      <w:lvlText w:val=""/>
+      <w:lvlJc w:val="left"/>
+      <w:pPr>
+        <w:ind w:left="5040" w:hanging="360"/>
+      </w:pPr>
+      <w:rPr>
+        <w:rFonts w:ascii="Symbol" w:hAnsi="Symbol" w:hint="default"/>
+      </w:rPr>
+    </w:lvl>
+    <w:lvl w:ilvl="7" w:tplc="04090003" w:tentative="1">
+      <w:start w:val="1"/>
+      <w:numFmt w:val="bullet"/>
+      <w:lvlText w:val="o"/>
+      <w:lvlJc w:val="left"/>
+      <w:pPr>
+        <w:ind w:left="5760" w:hanging="360"/>
+      </w:pPr>
+      <w:rPr>
+        <w:rFonts w:ascii="Courier New" w:hAnsi="Courier New" w:cs="Courier New" w:hint="default"/>
+      </w:rPr>
+    </w:lvl>
+    <w:lvl w:ilvl="8" w:tplc="04090005" w:tentative="1">
+      <w:start w:val="1"/>
+      <w:numFmt w:val="bullet"/>
+      <w:lvlText w:val=""/>
+      <w:lvlJc w:val="left"/>
+      <w:pPr>
+        <w:ind w:left="6480" w:hanging="360"/>
+      </w:pPr>
+      <w:rPr>
+        <w:rFonts w:ascii="Wingdings" w:hAnsi="Wingdings" w:hint="default"/>
+      </w:rPr>
+    </w:lvl>
+  </w:abstractNum>
+  <w:abstractNum w:abstractNumId="7" w15:restartNumberingAfterBreak="0">
     <w:nsid w:val="49160703"/>
     <w:multiLevelType w:val="hybridMultilevel"/>
     <w:tmpl w:val="378C802A"/>
@@ -2033,7 +2389,269 @@
       </w:rPr>
     </w:lvl>
   </w:abstractNum>
-  <w:abstractNum w:abstractNumId="4" w15:restartNumberingAfterBreak="0">
+  <w:abstractNum w:abstractNumId="8" w15:restartNumberingAfterBreak="0">
+    <w:nsid w:val="49AD2A6E"/>
+    <w:multiLevelType w:val="multilevel"/>
+    <w:tmpl w:val="D334221C"/>
+    <w:lvl w:ilvl="0">
+      <w:start w:val="1"/>
+      <w:numFmt w:val="bullet"/>
+      <w:lvlText w:val=""/>
+      <w:lvlJc w:val="left"/>
+      <w:pPr>
+        <w:tabs>
+          <w:tab w:val="num" w:pos="720"/>
+        </w:tabs>
+        <w:ind w:left="720" w:hanging="360"/>
+      </w:pPr>
+      <w:rPr>
+        <w:rFonts w:ascii="Symbol" w:hAnsi="Symbol" w:hint="default"/>
+        <w:sz w:val="20"/>
+      </w:rPr>
+    </w:lvl>
+    <w:lvl w:ilvl="1" w:tentative="1">
+      <w:start w:val="1"/>
+      <w:numFmt w:val="bullet"/>
+      <w:lvlText w:val="o"/>
+      <w:lvlJc w:val="left"/>
+      <w:pPr>
+        <w:tabs>
+          <w:tab w:val="num" w:pos="1440"/>
+        </w:tabs>
+        <w:ind w:left="1440" w:hanging="360"/>
+      </w:pPr>
+      <w:rPr>
+        <w:rFonts w:ascii="Courier New" w:hAnsi="Courier New" w:hint="default"/>
+        <w:sz w:val="20"/>
+      </w:rPr>
+    </w:lvl>
+    <w:lvl w:ilvl="2" w:tentative="1">
+      <w:start w:val="1"/>
+      <w:numFmt w:val="bullet"/>
+      <w:lvlText w:val=""/>
+      <w:lvlJc w:val="left"/>
+      <w:pPr>
+        <w:tabs>
+          <w:tab w:val="num" w:pos="2160"/>
+        </w:tabs>
+        <w:ind w:left="2160" w:hanging="360"/>
+      </w:pPr>
+      <w:rPr>
+        <w:rFonts w:ascii="Wingdings" w:hAnsi="Wingdings" w:hint="default"/>
+        <w:sz w:val="20"/>
+      </w:rPr>
+    </w:lvl>
+    <w:lvl w:ilvl="3" w:tentative="1">
+      <w:start w:val="1"/>
+      <w:numFmt w:val="bullet"/>
+      <w:lvlText w:val=""/>
+      <w:lvlJc w:val="left"/>
+      <w:pPr>
+        <w:tabs>
+          <w:tab w:val="num" w:pos="2880"/>
+        </w:tabs>
+        <w:ind w:left="2880" w:hanging="360"/>
+      </w:pPr>
+      <w:rPr>
+        <w:rFonts w:ascii="Wingdings" w:hAnsi="Wingdings" w:hint="default"/>
+        <w:sz w:val="20"/>
+      </w:rPr>
+    </w:lvl>
+    <w:lvl w:ilvl="4" w:tentative="1">
+      <w:start w:val="1"/>
+      <w:numFmt w:val="bullet"/>
+      <w:lvlText w:val=""/>
+      <w:lvlJc w:val="left"/>
+      <w:pPr>
+        <w:tabs>
+          <w:tab w:val="num" w:pos="3600"/>
+        </w:tabs>
+        <w:ind w:left="3600" w:hanging="360"/>
+      </w:pPr>
+      <w:rPr>
+        <w:rFonts w:ascii="Wingdings" w:hAnsi="Wingdings" w:hint="default"/>
+        <w:sz w:val="20"/>
+      </w:rPr>
+    </w:lvl>
+    <w:lvl w:ilvl="5" w:tentative="1">
+      <w:start w:val="1"/>
+      <w:numFmt w:val="bullet"/>
+      <w:lvlText w:val=""/>
+      <w:lvlJc w:val="left"/>
+      <w:pPr>
+        <w:tabs>
+          <w:tab w:val="num" w:pos="4320"/>
+        </w:tabs>
+        <w:ind w:left="4320" w:hanging="360"/>
+      </w:pPr>
+      <w:rPr>
+        <w:rFonts w:ascii="Wingdings" w:hAnsi="Wingdings" w:hint="default"/>
+        <w:sz w:val="20"/>
+      </w:rPr>
+    </w:lvl>
+    <w:lvl w:ilvl="6" w:tentative="1">
+      <w:start w:val="1"/>
+      <w:numFmt w:val="bullet"/>
+      <w:lvlText w:val=""/>
+      <w:lvlJc w:val="left"/>
+      <w:pPr>
+        <w:tabs>
+          <w:tab w:val="num" w:pos="5040"/>
+        </w:tabs>
+        <w:ind w:left="5040" w:hanging="360"/>
+      </w:pPr>
+      <w:rPr>
+        <w:rFonts w:ascii="Wingdings" w:hAnsi="Wingdings" w:hint="default"/>
+        <w:sz w:val="20"/>
+      </w:rPr>
+    </w:lvl>
+    <w:lvl w:ilvl="7" w:tentative="1">
+      <w:start w:val="1"/>
+      <w:numFmt w:val="bullet"/>
+      <w:lvlText w:val=""/>
+      <w:lvlJc w:val="left"/>
+      <w:pPr>
+        <w:tabs>
+          <w:tab w:val="num" w:pos="5760"/>
+        </w:tabs>
+        <w:ind w:left="5760" w:hanging="360"/>
+      </w:pPr>
+      <w:rPr>
+        <w:rFonts w:ascii="Wingdings" w:hAnsi="Wingdings" w:hint="default"/>
+        <w:sz w:val="20"/>
+      </w:rPr>
+    </w:lvl>
+    <w:lvl w:ilvl="8" w:tentative="1">
+      <w:start w:val="1"/>
+      <w:numFmt w:val="bullet"/>
+      <w:lvlText w:val=""/>
+      <w:lvlJc w:val="left"/>
+      <w:pPr>
+        <w:tabs>
+          <w:tab w:val="num" w:pos="6480"/>
+        </w:tabs>
+        <w:ind w:left="6480" w:hanging="360"/>
+      </w:pPr>
+      <w:rPr>
+        <w:rFonts w:ascii="Wingdings" w:hAnsi="Wingdings" w:hint="default"/>
+        <w:sz w:val="20"/>
+      </w:rPr>
+    </w:lvl>
+  </w:abstractNum>
+  <w:abstractNum w:abstractNumId="9" w15:restartNumberingAfterBreak="0">
+    <w:nsid w:val="4F564CEC"/>
+    <w:multiLevelType w:val="hybridMultilevel"/>
+    <w:tmpl w:val="854ACAD6"/>
+    <w:lvl w:ilvl="0" w:tplc="04090001">
+      <w:start w:val="1"/>
+      <w:numFmt w:val="bullet"/>
+      <w:lvlText w:val=""/>
+      <w:lvlJc w:val="left"/>
+      <w:pPr>
+        <w:ind w:left="720" w:hanging="360"/>
+      </w:pPr>
+      <w:rPr>
+        <w:rFonts w:ascii="Symbol" w:hAnsi="Symbol" w:hint="default"/>
+      </w:rPr>
+    </w:lvl>
+    <w:lvl w:ilvl="1" w:tplc="04090003" w:tentative="1">
+      <w:start w:val="1"/>
+      <w:numFmt w:val="bullet"/>
+      <w:lvlText w:val="o"/>
+      <w:lvlJc w:val="left"/>
+      <w:pPr>
+        <w:ind w:left="1440" w:hanging="360"/>
+      </w:pPr>
+      <w:rPr>
+        <w:rFonts w:ascii="Courier New" w:hAnsi="Courier New" w:cs="Courier New" w:hint="default"/>
+      </w:rPr>
+    </w:lvl>
+    <w:lvl w:ilvl="2" w:tplc="04090005" w:tentative="1">
+      <w:start w:val="1"/>
+      <w:numFmt w:val="bullet"/>
+      <w:lvlText w:val=""/>
+      <w:lvlJc w:val="left"/>
+      <w:pPr>
+        <w:ind w:left="2160" w:hanging="360"/>
+      </w:pPr>
+      <w:rPr>
+        <w:rFonts w:ascii="Wingdings" w:hAnsi="Wingdings" w:hint="default"/>
+      </w:rPr>
+    </w:lvl>
+    <w:lvl w:ilvl="3" w:tplc="04090001" w:tentative="1">
+      <w:start w:val="1"/>
+      <w:numFmt w:val="bullet"/>
+      <w:lvlText w:val=""/>
+      <w:lvlJc w:val="left"/>
+      <w:pPr>
+        <w:ind w:left="2880" w:hanging="360"/>
+      </w:pPr>
+      <w:rPr>
+        <w:rFonts w:ascii="Symbol" w:hAnsi="Symbol" w:hint="default"/>
+      </w:rPr>
+    </w:lvl>
+    <w:lvl w:ilvl="4" w:tplc="04090003" w:tentative="1">
+      <w:start w:val="1"/>
+      <w:numFmt w:val="bullet"/>
+      <w:lvlText w:val="o"/>
+      <w:lvlJc w:val="left"/>
+      <w:pPr>
+        <w:ind w:left="3600" w:hanging="360"/>
+      </w:pPr>
+      <w:rPr>
+        <w:rFonts w:ascii="Courier New" w:hAnsi="Courier New" w:cs="Courier New" w:hint="default"/>
+      </w:rPr>
+    </w:lvl>
+    <w:lvl w:ilvl="5" w:tplc="04090005" w:tentative="1">
+      <w:start w:val="1"/>
+      <w:numFmt w:val="bullet"/>
+      <w:lvlText w:val=""/>
+      <w:lvlJc w:val="left"/>
+      <w:pPr>
+        <w:ind w:left="4320" w:hanging="360"/>
+      </w:pPr>
+      <w:rPr>
+        <w:rFonts w:ascii="Wingdings" w:hAnsi="Wingdings" w:hint="default"/>
+      </w:rPr>
+    </w:lvl>
+    <w:lvl w:ilvl="6" w:tplc="04090001" w:tentative="1">
+      <w:start w:val="1"/>
+      <w:numFmt w:val="bullet"/>
+      <w:lvlText w:val=""/>
+      <w:lvlJc w:val="left"/>
+      <w:pPr>
+        <w:ind w:left="5040" w:hanging="360"/>
+      </w:pPr>
+      <w:rPr>
+        <w:rFonts w:ascii="Symbol" w:hAnsi="Symbol" w:hint="default"/>
+      </w:rPr>
+    </w:lvl>
+    <w:lvl w:ilvl="7" w:tplc="04090003" w:tentative="1">
+      <w:start w:val="1"/>
+      <w:numFmt w:val="bullet"/>
+      <w:lvlText w:val="o"/>
+      <w:lvlJc w:val="left"/>
+      <w:pPr>
+        <w:ind w:left="5760" w:hanging="360"/>
+      </w:pPr>
+      <w:rPr>
+        <w:rFonts w:ascii="Courier New" w:hAnsi="Courier New" w:cs="Courier New" w:hint="default"/>
+      </w:rPr>
+    </w:lvl>
+    <w:lvl w:ilvl="8" w:tplc="04090005" w:tentative="1">
+      <w:start w:val="1"/>
+      <w:numFmt w:val="bullet"/>
+      <w:lvlText w:val=""/>
+      <w:lvlJc w:val="left"/>
+      <w:pPr>
+        <w:ind w:left="6480" w:hanging="360"/>
+      </w:pPr>
+      <w:rPr>
+        <w:rFonts w:ascii="Wingdings" w:hAnsi="Wingdings" w:hint="default"/>
+      </w:rPr>
+    </w:lvl>
+  </w:abstractNum>
+  <w:abstractNum w:abstractNumId="10" w15:restartNumberingAfterBreak="0">
     <w:nsid w:val="558A4706"/>
     <w:multiLevelType w:val="hybridMultilevel"/>
     <w:tmpl w:val="FE0EE60A"/>
@@ -2146,7 +2764,7 @@
       </w:rPr>
     </w:lvl>
   </w:abstractNum>
-  <w:abstractNum w:abstractNumId="5" w15:restartNumberingAfterBreak="0">
+  <w:abstractNum w:abstractNumId="11" w15:restartNumberingAfterBreak="0">
     <w:nsid w:val="5F29002D"/>
     <w:multiLevelType w:val="hybridMultilevel"/>
     <w:tmpl w:val="E69A2C1E"/>
@@ -2259,23 +2877,157 @@
       </w:rPr>
     </w:lvl>
   </w:abstractNum>
+  <w:abstractNum w:abstractNumId="12" w15:restartNumberingAfterBreak="0">
+    <w:nsid w:val="64916396"/>
+    <w:multiLevelType w:val="hybridMultilevel"/>
+    <w:tmpl w:val="65C21BC0"/>
+    <w:lvl w:ilvl="0" w:tplc="04090001">
+      <w:start w:val="1"/>
+      <w:numFmt w:val="bullet"/>
+      <w:lvlText w:val=""/>
+      <w:lvlJc w:val="left"/>
+      <w:pPr>
+        <w:ind w:left="720" w:hanging="360"/>
+      </w:pPr>
+      <w:rPr>
+        <w:rFonts w:ascii="Symbol" w:hAnsi="Symbol" w:hint="default"/>
+      </w:rPr>
+    </w:lvl>
+    <w:lvl w:ilvl="1" w:tplc="04090003" w:tentative="1">
+      <w:start w:val="1"/>
+      <w:numFmt w:val="bullet"/>
+      <w:lvlText w:val="o"/>
+      <w:lvlJc w:val="left"/>
+      <w:pPr>
+        <w:ind w:left="1440" w:hanging="360"/>
+      </w:pPr>
+      <w:rPr>
+        <w:rFonts w:ascii="Courier New" w:hAnsi="Courier New" w:cs="Courier New" w:hint="default"/>
+      </w:rPr>
+    </w:lvl>
+    <w:lvl w:ilvl="2" w:tplc="04090005" w:tentative="1">
+      <w:start w:val="1"/>
+      <w:numFmt w:val="bullet"/>
+      <w:lvlText w:val=""/>
+      <w:lvlJc w:val="left"/>
+      <w:pPr>
+        <w:ind w:left="2160" w:hanging="360"/>
+      </w:pPr>
+      <w:rPr>
+        <w:rFonts w:ascii="Wingdings" w:hAnsi="Wingdings" w:hint="default"/>
+      </w:rPr>
+    </w:lvl>
+    <w:lvl w:ilvl="3" w:tplc="04090001" w:tentative="1">
+      <w:start w:val="1"/>
+      <w:numFmt w:val="bullet"/>
+      <w:lvlText w:val=""/>
+      <w:lvlJc w:val="left"/>
+      <w:pPr>
+        <w:ind w:left="2880" w:hanging="360"/>
+      </w:pPr>
+      <w:rPr>
+        <w:rFonts w:ascii="Symbol" w:hAnsi="Symbol" w:hint="default"/>
+      </w:rPr>
+    </w:lvl>
+    <w:lvl w:ilvl="4" w:tplc="04090003" w:tentative="1">
+      <w:start w:val="1"/>
+      <w:numFmt w:val="bullet"/>
+      <w:lvlText w:val="o"/>
+      <w:lvlJc w:val="left"/>
+      <w:pPr>
+        <w:ind w:left="3600" w:hanging="360"/>
+      </w:pPr>
+      <w:rPr>
+        <w:rFonts w:ascii="Courier New" w:hAnsi="Courier New" w:cs="Courier New" w:hint="default"/>
+      </w:rPr>
+    </w:lvl>
+    <w:lvl w:ilvl="5" w:tplc="04090005" w:tentative="1">
+      <w:start w:val="1"/>
+      <w:numFmt w:val="bullet"/>
+      <w:lvlText w:val=""/>
+      <w:lvlJc w:val="left"/>
+      <w:pPr>
+        <w:ind w:left="4320" w:hanging="360"/>
+      </w:pPr>
+      <w:rPr>
+        <w:rFonts w:ascii="Wingdings" w:hAnsi="Wingdings" w:hint="default"/>
+      </w:rPr>
+    </w:lvl>
+    <w:lvl w:ilvl="6" w:tplc="04090001" w:tentative="1">
+      <w:start w:val="1"/>
+      <w:numFmt w:val="bullet"/>
+      <w:lvlText w:val=""/>
+      <w:lvlJc w:val="left"/>
+      <w:pPr>
+        <w:ind w:left="5040" w:hanging="360"/>
+      </w:pPr>
+      <w:rPr>
+        <w:rFonts w:ascii="Symbol" w:hAnsi="Symbol" w:hint="default"/>
+      </w:rPr>
+    </w:lvl>
+    <w:lvl w:ilvl="7" w:tplc="04090003" w:tentative="1">
+      <w:start w:val="1"/>
+      <w:numFmt w:val="bullet"/>
+      <w:lvlText w:val="o"/>
+      <w:lvlJc w:val="left"/>
+      <w:pPr>
+        <w:ind w:left="5760" w:hanging="360"/>
+      </w:pPr>
+      <w:rPr>
+        <w:rFonts w:ascii="Courier New" w:hAnsi="Courier New" w:cs="Courier New" w:hint="default"/>
+      </w:rPr>
+    </w:lvl>
+    <w:lvl w:ilvl="8" w:tplc="04090005" w:tentative="1">
+      <w:start w:val="1"/>
+      <w:numFmt w:val="bullet"/>
+      <w:lvlText w:val=""/>
+      <w:lvlJc w:val="left"/>
+      <w:pPr>
+        <w:ind w:left="6480" w:hanging="360"/>
+      </w:pPr>
+      <w:rPr>
+        <w:rFonts w:ascii="Wingdings" w:hAnsi="Wingdings" w:hint="default"/>
+      </w:rPr>
+    </w:lvl>
+  </w:abstractNum>
   <w:num w:numId="1" w16cid:durableId="246882893">
+    <w:abstractNumId w:val="3"/>
+  </w:num>
+  <w:num w:numId="2" w16cid:durableId="2032561181">
+    <w:abstractNumId w:val="2"/>
+  </w:num>
+  <w:num w:numId="3" w16cid:durableId="2006662296">
+    <w:abstractNumId w:val="4"/>
+  </w:num>
+  <w:num w:numId="4" w16cid:durableId="214589895">
+    <w:abstractNumId w:val="11"/>
+  </w:num>
+  <w:num w:numId="5" w16cid:durableId="1843161927">
+    <w:abstractNumId w:val="10"/>
+  </w:num>
+  <w:num w:numId="6" w16cid:durableId="1436560685">
+    <w:abstractNumId w:val="7"/>
+  </w:num>
+  <w:num w:numId="7" w16cid:durableId="1982270681">
+    <w:abstractNumId w:val="0"/>
+  </w:num>
+  <w:num w:numId="8" w16cid:durableId="1723750898">
+    <w:abstractNumId w:val="9"/>
+  </w:num>
+  <w:num w:numId="9" w16cid:durableId="1020668528">
+    <w:abstractNumId w:val="5"/>
+  </w:num>
+  <w:num w:numId="10" w16cid:durableId="22100486">
     <w:abstractNumId w:val="1"/>
   </w:num>
-  <w:num w:numId="2" w16cid:durableId="2032561181">
-    <w:abstractNumId w:val="0"/>
+  <w:num w:numId="11" w16cid:durableId="1735928559">
+    <w:abstractNumId w:val="6"/>
   </w:num>
-  <w:num w:numId="3" w16cid:durableId="2006662296">
-    <w:abstractNumId w:val="2"/>
+  <w:num w:numId="12" w16cid:durableId="1911891197">
+    <w:abstractNumId w:val="8"/>
   </w:num>
-  <w:num w:numId="4" w16cid:durableId="214589895">
-    <w:abstractNumId w:val="5"/>
-  </w:num>
-  <w:num w:numId="5" w16cid:durableId="1843161927">
-    <w:abstractNumId w:val="4"/>
-  </w:num>
-  <w:num w:numId="6" w16cid:durableId="1436560685">
-    <w:abstractNumId w:val="3"/>
+  <w:num w:numId="13" w16cid:durableId="306282193">
+    <w:abstractNumId w:val="12"/>
   </w:num>
 </w:numbering>
 </file>
@@ -3428,6 +4180,17 @@
     <w:unhideWhenUsed/>
     <w:rsid w:val="006B2321"/>
   </w:style>
+  <w:style w:type="character" w:styleId="Strong">
+    <w:name w:val="Strong"/>
+    <w:basedOn w:val="DefaultParagraphFont"/>
+    <w:uiPriority w:val="22"/>
+    <w:qFormat/>
+    <w:rsid w:val="00770075"/>
+    <w:rPr>
+      <w:b/>
+      <w:bCs/>
+    </w:rPr>
+  </w:style>
 </w:styles>
 </file>
 

</xml_diff>